<commit_message>
Add the NZALC ELDA Course Portfolio with contents page
Compile the pathway overview and the four course data sheets into one
document with a cover and table of contents. Restructure the data-sheet
and pathway builders into reusable functions so the portfolio renders the
same sources as the standalone documents.

Co-Authored-By: Claude Fable 5.1 <noreply@anthropic.com>
Claude-Session: https://claude.ai/code/session_01LgFPs3fMSncBgbYQ3PfA3o
</commit_message>
<xml_diff>
--- a/output/elda-command-data-sheet.docx
+++ b/output/elda-command-data-sheet.docx
@@ -3669,6 +3669,27 @@
       <w:sz w:val="24"/>
     </w:rPr>
   </w:style>
+  <w:style w:type="paragraph" w:styleId="Heading2">
+    <w:name w:val="Heading 2"/>
+    <w:basedOn w:val="Normal"/>
+    <w:next w:val="Normal"/>
+    <w:uiPriority w:val="9"/>
+    <w:unhideWhenUsed/>
+    <w:qFormat/>
+    <w:rsid w:val="00fc693f"/>
+    <w:pPr>
+      <w:keepNext w:val="true"/>
+      <w:keepLines/>
+      <w:spacing w:before="240" w:after="100"/>
+      <w:outlineLvl w:val="1"/>
+    </w:pPr>
+    <w:rPr>
+      <w:rFonts w:ascii="Arial" w:hAnsi="Arial" w:cs="Arial"/>
+      <w:b/>
+      <w:color w:val="002516"/>
+      <w:sz w:val="24"/>
+    </w:rPr>
+  </w:style>
   <w:style w:type="character" w:styleId="DefaultParagraphFont" w:default="1">
     <w:name w:val="Default Paragraph Font"/>
     <w:uiPriority w:val="1"/>
@@ -3771,6 +3792,26 @@
         <w:tab w:val="right" w:pos="9360" w:leader="none"/>
       </w:tabs>
       <w:spacing w:lineRule="auto" w:line="240" w:before="0" w:after="0"/>
+    </w:pPr>
+    <w:rPr/>
+  </w:style>
+  <w:style w:type="paragraph" w:styleId="IndexHeading">
+    <w:name w:val="Index Heading"/>
+    <w:basedOn w:val="Heading"/>
+    <w:pPr/>
+    <w:rPr/>
+  </w:style>
+  <w:style w:type="paragraph" w:styleId="TOCHeading">
+    <w:name w:val="TOC Heading"/>
+    <w:basedOn w:val="Heading1"/>
+    <w:next w:val="Normal"/>
+    <w:uiPriority w:val="39"/>
+    <w:semiHidden/>
+    <w:unhideWhenUsed/>
+    <w:qFormat/>
+    <w:rsid w:val="00fc693f"/>
+    <w:pPr>
+      <w:outlineLvl w:val="9"/>
     </w:pPr>
     <w:rPr/>
   </w:style>

</xml_diff>

<commit_message>
Refine the ELDA portfolio for validation
Match overview learning-outcome titles to the data sheets exactly, add
judgement to Lead Systems LO 1.1, make Command LO 1.4 distinctly
command-level, retitle the portfolio as a proposed revision with a Draft
for Validation status, and add a Points for Validation page listing every
carried-over administrative placeholder.

Co-Authored-By: Claude Fable 5.1 <noreply@anthropic.com>
Claude-Session: https://claude.ai/code/session_01LgFPs3fMSncBgbYQ3PfA3o
</commit_message>
<xml_diff>
--- a/output/elda-command-data-sheet.docx
+++ b/output/elda-command-data-sheet.docx
@@ -81,7 +81,7 @@
           <w:color w:val="002516"/>
           <w:sz w:val="24"/>
         </w:rPr>
-        <w:t>Course Data Sheet</w:t>
+        <w:t>Proposed Revised Course Data Sheet</w:t>
       </w:r>
     </w:p>
     <w:p>
@@ -147,6 +147,29 @@
           <w:sz w:val="18"/>
         </w:rPr>
         <w:t>September 2026</w:t>
+      </w:r>
+      <w:r>
+        <w:rPr>
+          <w:rFonts w:cs="Arial"/>
+        </w:rPr>
+        <w:t xml:space="preserve">      </w:t>
+      </w:r>
+      <w:r>
+        <w:rPr>
+          <w:rFonts w:cs="Arial"/>
+          <w:b/>
+          <w:color w:val="002516"/>
+          <w:sz w:val="18"/>
+        </w:rPr>
+        <w:t xml:space="preserve">Status  </w:t>
+      </w:r>
+      <w:r>
+        <w:rPr>
+          <w:rFonts w:cs="Arial"/>
+          <w:color w:val="000000"/>
+          <w:sz w:val="18"/>
+        </w:rPr>
+        <w:t>Draft for Validation</w:t>
       </w:r>
     </w:p>
     <w:p>
@@ -3114,7 +3137,7 @@
           <w:color w:val="000000"/>
           <w:sz w:val="20"/>
         </w:rPr>
-        <w:t>LO 1.4: Develop strategies for continued command and leadership effectiveness</w:t>
+        <w:t>LO 1.4: Establish strategies for sustained command effectiveness across changing contexts</w:t>
       </w:r>
     </w:p>
     <w:p>
@@ -3132,7 +3155,7 @@
           <w:b w:val="false"/>
           <w:i w:val="false"/>
         </w:rPr>
-        <w:t>Learners integrate experiential learning, feedback and self-evaluation to identify command and leadership strengths, risks and development priorities, and establish deliberate strategies for continued effectiveness across changing contexts and responsibilities.</w:t>
+        <w:t>Learners integrate experiential learning, feedback and self-evaluation to identify command and leadership strengths, risks and development priorities, and establish deliberate strategies for sustained command effectiveness across changing contexts and responsibilities.</w:t>
       </w:r>
     </w:p>
     <w:sectPr>

</xml_diff>

<commit_message>
Design pass on the ELDA portfolio
Hero cover block, layered course title blocks with a pathway locator,
prominent course band and developmental-logic row on the pathway page
with a key-message panel, lighter tables with standard section spacing,
learning-outcome blocks, subordinated notes, dark-green bullets and
shortened footers.

Co-Authored-By: Claude Fable 5.1 <noreply@anthropic.com>
Claude-Session: https://claude.ai/code/session_01LgFPs3fMSncBgbYQ3PfA3o
</commit_message>
<xml_diff>
--- a/output/elda-command-data-sheet.docx
+++ b/output/elda-command-data-sheet.docx
@@ -5,7 +5,7 @@
     <w:p>
       <w:pPr>
         <w:pStyle w:val="Normal"/>
-        <w:spacing w:before="0" w:after="280"/>
+        <w:spacing w:before="0" w:after="200"/>
         <w:rPr/>
       </w:pPr>
       <w:r>
@@ -52,7 +52,29 @@
     <w:p>
       <w:pPr>
         <w:pStyle w:val="Normal"/>
-        <w:spacing w:before="0" w:after="20"/>
+        <w:keepNext w:val="true"/>
+        <w:pageBreakBefore w:val="false"/>
+        <w:spacing w:before="0" w:after="0"/>
+        <w:rPr/>
+      </w:pPr>
+      <w:r>
+        <w:rPr>
+          <w:rFonts w:cs="Arial"/>
+          <w:b/>
+          <w:i w:val="false"/>
+          <w:color w:val="002516"/>
+          <w:spacing w:val="40"/>
+          <w:sz w:val="20"/>
+        </w:rPr>
+        <w:t>A18009</w:t>
+      </w:r>
+    </w:p>
+    <w:p>
+      <w:pPr>
+        <w:pStyle w:val="Normal"/>
+        <w:keepNext w:val="true"/>
+        <w:pageBreakBefore w:val="false"/>
+        <w:spacing w:before="0" w:after="80"/>
         <w:rPr/>
       </w:pPr>
       <w:r>
@@ -60,66 +82,73 @@
           <w:rFonts w:cs="Arial"/>
           <w:b/>
           <w:color w:val="000000"/>
-          <w:sz w:val="40"/>
-        </w:rPr>
-        <w:t>A18009 ELDA Command</w:t>
-      </w:r>
-    </w:p>
-    <w:p>
-      <w:pPr>
-        <w:pStyle w:val="Normal"/>
+          <w:sz w:val="48"/>
+        </w:rPr>
+        <w:t>ELDA Command</w:t>
+      </w:r>
+    </w:p>
+    <w:p>
+      <w:pPr>
+        <w:pStyle w:val="Normal"/>
+        <w:keepNext w:val="true"/>
         <w:pBdr>
           <w:bottom w:val="single" w:sz="18" w:space="8" w:color="C62026"/>
         </w:pBdr>
-        <w:spacing w:before="0" w:after="80"/>
+        <w:spacing w:before="0" w:after="120"/>
         <w:rPr/>
       </w:pPr>
       <w:r>
         <w:rPr>
           <w:rFonts w:cs="Arial"/>
           <w:b/>
+          <w:i w:val="false"/>
           <w:color w:val="002516"/>
-          <w:sz w:val="24"/>
-        </w:rPr>
-        <w:t>Proposed Revised Course Data Sheet</w:t>
-      </w:r>
-    </w:p>
-    <w:p>
-      <w:pPr>
-        <w:pStyle w:val="Normal"/>
-        <w:spacing w:before="120" w:after="120"/>
-        <w:rPr/>
-      </w:pPr>
-      <w:r>
-        <w:rPr>
-          <w:rFonts w:cs="Arial"/>
+          <w:spacing w:val="30"/>
+          <w:sz w:val="19"/>
+        </w:rPr>
+        <w:t>PROPOSED REVISED COURSE DATA SHEET</w:t>
+      </w:r>
+    </w:p>
+    <w:p>
+      <w:pPr>
+        <w:pStyle w:val="Normal"/>
+        <w:keepNext w:val="true"/>
+        <w:spacing w:before="120" w:after="40"/>
+        <w:rPr/>
+      </w:pPr>
+      <w:r>
+        <w:rPr>
+          <w:rFonts w:cs="Arial"/>
+          <w:b w:val="false"/>
+          <w:i w:val="false"/>
           <w:color w:val="002516"/>
-          <w:sz w:val="21"/>
-        </w:rPr>
-        <w:t>NZ Army Leadership Centre | Army Command School</w:t>
-      </w:r>
-    </w:p>
-    <w:p>
-      <w:pPr>
-        <w:pStyle w:val="Normal"/>
-        <w:pBdr>
-          <w:bottom w:val="single" w:sz="6" w:space="6" w:color="A89662"/>
-        </w:pBdr>
-        <w:spacing w:before="0" w:after="200"/>
+          <w:sz w:val="20"/>
+        </w:rPr>
+        <w:t>New Zealand Army Leadership Centre | Army Command School</w:t>
+      </w:r>
+    </w:p>
+    <w:p>
+      <w:pPr>
+        <w:pStyle w:val="Normal"/>
+        <w:keepNext w:val="true"/>
+        <w:spacing w:before="0" w:after="0"/>
         <w:rPr/>
       </w:pPr>
       <w:r>
         <w:rPr>
           <w:rFonts w:cs="Arial"/>
           <w:b/>
+          <w:i w:val="false"/>
           <w:color w:val="002516"/>
           <w:sz w:val="18"/>
         </w:rPr>
-        <w:t xml:space="preserve">Reference  </w:t>
-      </w:r>
-      <w:r>
-        <w:rPr>
-          <w:rFonts w:cs="Arial"/>
+        <w:t xml:space="preserve">Reference: </w:t>
+      </w:r>
+      <w:r>
+        <w:rPr>
+          <w:rFonts w:cs="Arial"/>
+          <w:b w:val="false"/>
+          <w:i w:val="false"/>
           <w:color w:val="000000"/>
           <w:sz w:val="18"/>
         </w:rPr>
@@ -128,21 +157,28 @@
       <w:r>
         <w:rPr>
           <w:rFonts w:cs="Arial"/>
-        </w:rPr>
-        <w:t xml:space="preserve">      </w:t>
+          <w:b w:val="false"/>
+          <w:i w:val="false"/>
+          <w:color w:val="A89662"/>
+          <w:sz w:val="18"/>
+        </w:rPr>
+        <w:t xml:space="preserve">   ·   </w:t>
       </w:r>
       <w:r>
         <w:rPr>
           <w:rFonts w:cs="Arial"/>
           <w:b/>
+          <w:i w:val="false"/>
           <w:color w:val="002516"/>
           <w:sz w:val="18"/>
         </w:rPr>
-        <w:t xml:space="preserve">Date  </w:t>
-      </w:r>
-      <w:r>
-        <w:rPr>
-          <w:rFonts w:cs="Arial"/>
+        <w:t xml:space="preserve">Date: </w:t>
+      </w:r>
+      <w:r>
+        <w:rPr>
+          <w:rFonts w:cs="Arial"/>
+          <w:b w:val="false"/>
+          <w:i w:val="false"/>
           <w:color w:val="000000"/>
           <w:sz w:val="18"/>
         </w:rPr>
@@ -151,22 +187,29 @@
       <w:r>
         <w:rPr>
           <w:rFonts w:cs="Arial"/>
-        </w:rPr>
-        <w:t xml:space="preserve">      </w:t>
+          <w:b w:val="false"/>
+          <w:i w:val="false"/>
+          <w:color w:val="A89662"/>
+          <w:sz w:val="18"/>
+        </w:rPr>
+        <w:t xml:space="preserve">   ·   </w:t>
       </w:r>
       <w:r>
         <w:rPr>
           <w:rFonts w:cs="Arial"/>
           <w:b/>
+          <w:i w:val="false"/>
           <w:color w:val="002516"/>
           <w:sz w:val="18"/>
         </w:rPr>
-        <w:t xml:space="preserve">Status  </w:t>
-      </w:r>
-      <w:r>
-        <w:rPr>
-          <w:rFonts w:cs="Arial"/>
-          <w:color w:val="000000"/>
+        <w:t xml:space="preserve">Status: </w:t>
+      </w:r>
+      <w:r>
+        <w:rPr>
+          <w:rFonts w:cs="Arial"/>
+          <w:b/>
+          <w:i w:val="false"/>
+          <w:color w:val="C62026"/>
           <w:sz w:val="18"/>
         </w:rPr>
         <w:t>Draft for Validation</w:t>
@@ -174,6 +217,87 @@
     </w:p>
     <w:p>
       <w:pPr>
+        <w:pStyle w:val="Normal"/>
+        <w:spacing w:before="120" w:after="40"/>
+        <w:rPr/>
+      </w:pPr>
+      <w:r>
+        <w:rPr>
+          <w:rFonts w:cs="Arial"/>
+          <w:b w:val="false"/>
+          <w:i w:val="false"/>
+          <w:color w:val="8A8A8A"/>
+          <w:spacing w:val="15"/>
+          <w:sz w:val="17"/>
+        </w:rPr>
+        <w:t>LEAD TEAMS</w:t>
+      </w:r>
+      <w:r>
+        <w:rPr>
+          <w:rFonts w:cs="Arial"/>
+          <w:b w:val="false"/>
+          <w:i w:val="false"/>
+          <w:color w:val="A89662"/>
+          <w:sz w:val="17"/>
+        </w:rPr>
+        <w:t xml:space="preserve">  →  </w:t>
+      </w:r>
+      <w:r>
+        <w:rPr>
+          <w:rFonts w:cs="Arial"/>
+          <w:b w:val="false"/>
+          <w:i w:val="false"/>
+          <w:color w:val="8A8A8A"/>
+          <w:spacing w:val="15"/>
+          <w:sz w:val="17"/>
+        </w:rPr>
+        <w:t>LEAD LEADERS</w:t>
+      </w:r>
+      <w:r>
+        <w:rPr>
+          <w:rFonts w:cs="Arial"/>
+          <w:b w:val="false"/>
+          <w:i w:val="false"/>
+          <w:color w:val="A89662"/>
+          <w:sz w:val="17"/>
+        </w:rPr>
+        <w:t xml:space="preserve">  →  </w:t>
+      </w:r>
+      <w:r>
+        <w:rPr>
+          <w:rFonts w:cs="Arial"/>
+          <w:b w:val="false"/>
+          <w:i w:val="false"/>
+          <w:color w:val="8A8A8A"/>
+          <w:spacing w:val="15"/>
+          <w:sz w:val="17"/>
+        </w:rPr>
+        <w:t>LEAD SYSTEMS</w:t>
+      </w:r>
+      <w:r>
+        <w:rPr>
+          <w:rFonts w:cs="Arial"/>
+          <w:b w:val="false"/>
+          <w:i w:val="false"/>
+          <w:color w:val="A89662"/>
+          <w:sz w:val="17"/>
+        </w:rPr>
+        <w:t xml:space="preserve">  →  </w:t>
+      </w:r>
+      <w:r>
+        <w:rPr>
+          <w:rFonts w:cs="Arial"/>
+          <w:b/>
+          <w:i w:val="false"/>
+          <w:color w:val="002516"/>
+          <w:spacing w:val="15"/>
+          <w:sz w:val="17"/>
+        </w:rPr>
+        <w:t>COMMAND</w:t>
+      </w:r>
+    </w:p>
+    <w:p>
+      <w:pPr>
         <w:pStyle w:val="Heading1"/>
         <w:rPr/>
       </w:pPr>
@@ -183,7 +307,7 @@
           <w:b/>
           <w:i w:val="false"/>
           <w:color w:val="002516"/>
-          <w:sz w:val="24"/>
+          <w:sz w:val="25"/>
         </w:rPr>
         <w:t>Course Information</w:t>
       </w:r>
@@ -192,13 +316,13 @@
       <w:tblPr>
         <w:tblW w:w="9298" w:type="dxa"/>
         <w:jc w:val="left"/>
-        <w:tblInd w:w="-8" w:type="dxa"/>
+        <w:tblInd w:w="2" w:type="dxa"/>
         <w:tblLayout w:type="fixed"/>
         <w:tblCellMar>
           <w:top w:w="60" w:type="dxa"/>
-          <w:left w:w="100" w:type="dxa"/>
+          <w:left w:w="110" w:type="dxa"/>
           <w:bottom w:w="60" w:type="dxa"/>
-          <w:right w:w="100" w:type="dxa"/>
+          <w:right w:w="110" w:type="dxa"/>
         </w:tblCellMar>
         <w:tblLook w:val="04a0" w:noHBand="0" w:noVBand="1" w:firstColumn="1" w:lastRow="0" w:lastColumn="0" w:firstRow="1"/>
       </w:tblPr>
@@ -216,15 +340,15 @@
             <w:tcBorders>
               <w:top w:val="single" w:sz="4" w:space="0" w:color="A89662"/>
               <w:left w:val="single" w:sz="4" w:space="0" w:color="A89662"/>
-              <w:bottom w:val="single" w:sz="4" w:space="0" w:color="A89662"/>
-              <w:right w:val="single" w:sz="4" w:space="0" w:color="A89662"/>
+              <w:bottom w:val="single" w:sz="4" w:space="0" w:color="D9D9D2"/>
+              <w:right w:val="single" w:sz="4" w:space="0" w:color="D9D9D2"/>
             </w:tcBorders>
             <w:shd w:color="auto" w:fill="002516" w:val="clear"/>
           </w:tcPr>
           <w:p>
             <w:pPr>
               <w:pStyle w:val="Normal"/>
-              <w:spacing w:lineRule="auto" w:line="252" w:before="0" w:after="0"/>
+              <w:spacing w:lineRule="auto" w:line="268" w:before="0" w:after="0"/>
               <w:rPr/>
             </w:pPr>
             <w:r>
@@ -244,8 +368,8 @@
             <w:tcW w:w="6689" w:type="dxa"/>
             <w:tcBorders>
               <w:top w:val="single" w:sz="4" w:space="0" w:color="A89662"/>
-              <w:left w:val="single" w:sz="4" w:space="0" w:color="A89662"/>
-              <w:bottom w:val="single" w:sz="4" w:space="0" w:color="A89662"/>
+              <w:left w:val="single" w:sz="4" w:space="0" w:color="D9D9D2"/>
+              <w:bottom w:val="single" w:sz="4" w:space="0" w:color="D9D9D2"/>
               <w:right w:val="single" w:sz="4" w:space="0" w:color="A89662"/>
             </w:tcBorders>
             <w:shd w:color="auto" w:fill="002516" w:val="clear"/>
@@ -253,7 +377,7 @@
           <w:p>
             <w:pPr>
               <w:pStyle w:val="Normal"/>
-              <w:spacing w:lineRule="auto" w:line="252" w:before="0" w:after="0"/>
+              <w:spacing w:lineRule="auto" w:line="268" w:before="0" w:after="0"/>
               <w:rPr/>
             </w:pPr>
             <w:r>
@@ -277,17 +401,17 @@
           <w:tcPr>
             <w:tcW w:w="2608" w:type="dxa"/>
             <w:tcBorders>
-              <w:top w:val="single" w:sz="4" w:space="0" w:color="A89662"/>
+              <w:top w:val="single" w:sz="4" w:space="0" w:color="D9D9D2"/>
               <w:left w:val="single" w:sz="4" w:space="0" w:color="A89662"/>
-              <w:bottom w:val="single" w:sz="4" w:space="0" w:color="A89662"/>
-              <w:right w:val="single" w:sz="4" w:space="0" w:color="A89662"/>
+              <w:bottom w:val="single" w:sz="4" w:space="0" w:color="D9D9D2"/>
+              <w:right w:val="single" w:sz="4" w:space="0" w:color="D9D9D2"/>
             </w:tcBorders>
             <w:shd w:color="auto" w:fill="CDD2B7" w:val="clear"/>
           </w:tcPr>
           <w:p>
             <w:pPr>
               <w:pStyle w:val="Normal"/>
-              <w:spacing w:lineRule="auto" w:line="252" w:before="0" w:after="0"/>
+              <w:spacing w:lineRule="auto" w:line="268" w:before="0" w:after="0"/>
               <w:rPr/>
             </w:pPr>
             <w:r>
@@ -306,16 +430,16 @@
           <w:tcPr>
             <w:tcW w:w="6689" w:type="dxa"/>
             <w:tcBorders>
-              <w:top w:val="single" w:sz="4" w:space="0" w:color="A89662"/>
-              <w:left w:val="single" w:sz="4" w:space="0" w:color="A89662"/>
-              <w:bottom w:val="single" w:sz="4" w:space="0" w:color="A89662"/>
+              <w:top w:val="single" w:sz="4" w:space="0" w:color="D9D9D2"/>
+              <w:left w:val="single" w:sz="4" w:space="0" w:color="D9D9D2"/>
+              <w:bottom w:val="single" w:sz="4" w:space="0" w:color="D9D9D2"/>
               <w:right w:val="single" w:sz="4" w:space="0" w:color="A89662"/>
             </w:tcBorders>
           </w:tcPr>
           <w:p>
             <w:pPr>
               <w:pStyle w:val="Normal"/>
-              <w:spacing w:lineRule="auto" w:line="252" w:before="0" w:after="0"/>
+              <w:spacing w:lineRule="auto" w:line="268" w:before="0" w:after="0"/>
               <w:rPr/>
             </w:pPr>
             <w:r>
@@ -323,7 +447,7 @@
                 <w:rFonts w:cs="Arial"/>
                 <w:b w:val="false"/>
                 <w:i w:val="false"/>
-                <w:sz w:val="20"/>
+                <w:sz w:val="19"/>
               </w:rPr>
               <w:t>A18009</w:t>
             </w:r>
@@ -338,17 +462,17 @@
           <w:tcPr>
             <w:tcW w:w="2608" w:type="dxa"/>
             <w:tcBorders>
-              <w:top w:val="single" w:sz="4" w:space="0" w:color="A89662"/>
+              <w:top w:val="single" w:sz="4" w:space="0" w:color="D9D9D2"/>
               <w:left w:val="single" w:sz="4" w:space="0" w:color="A89662"/>
-              <w:bottom w:val="single" w:sz="4" w:space="0" w:color="A89662"/>
-              <w:right w:val="single" w:sz="4" w:space="0" w:color="A89662"/>
+              <w:bottom w:val="single" w:sz="4" w:space="0" w:color="D9D9D2"/>
+              <w:right w:val="single" w:sz="4" w:space="0" w:color="D9D9D2"/>
             </w:tcBorders>
             <w:shd w:color="auto" w:fill="CDD2B7" w:val="clear"/>
           </w:tcPr>
           <w:p>
             <w:pPr>
               <w:pStyle w:val="Normal"/>
-              <w:spacing w:lineRule="auto" w:line="252" w:before="0" w:after="0"/>
+              <w:spacing w:lineRule="auto" w:line="268" w:before="0" w:after="0"/>
               <w:rPr/>
             </w:pPr>
             <w:r>
@@ -367,16 +491,16 @@
           <w:tcPr>
             <w:tcW w:w="6689" w:type="dxa"/>
             <w:tcBorders>
-              <w:top w:val="single" w:sz="4" w:space="0" w:color="A89662"/>
-              <w:left w:val="single" w:sz="4" w:space="0" w:color="A89662"/>
-              <w:bottom w:val="single" w:sz="4" w:space="0" w:color="A89662"/>
+              <w:top w:val="single" w:sz="4" w:space="0" w:color="D9D9D2"/>
+              <w:left w:val="single" w:sz="4" w:space="0" w:color="D9D9D2"/>
+              <w:bottom w:val="single" w:sz="4" w:space="0" w:color="D9D9D2"/>
               <w:right w:val="single" w:sz="4" w:space="0" w:color="A89662"/>
             </w:tcBorders>
           </w:tcPr>
           <w:p>
             <w:pPr>
               <w:pStyle w:val="Normal"/>
-              <w:spacing w:lineRule="auto" w:line="252" w:before="0" w:after="0"/>
+              <w:spacing w:lineRule="auto" w:line="268" w:before="0" w:after="0"/>
               <w:rPr/>
             </w:pPr>
             <w:r>
@@ -384,7 +508,7 @@
                 <w:rFonts w:cs="Arial"/>
                 <w:b w:val="false"/>
                 <w:i w:val="false"/>
-                <w:sz w:val="20"/>
+                <w:sz w:val="19"/>
               </w:rPr>
               <w:t>ELDA Command</w:t>
             </w:r>
@@ -399,17 +523,17 @@
           <w:tcPr>
             <w:tcW w:w="2608" w:type="dxa"/>
             <w:tcBorders>
-              <w:top w:val="single" w:sz="4" w:space="0" w:color="A89662"/>
+              <w:top w:val="single" w:sz="4" w:space="0" w:color="D9D9D2"/>
               <w:left w:val="single" w:sz="4" w:space="0" w:color="A89662"/>
-              <w:bottom w:val="single" w:sz="4" w:space="0" w:color="A89662"/>
-              <w:right w:val="single" w:sz="4" w:space="0" w:color="A89662"/>
+              <w:bottom w:val="single" w:sz="4" w:space="0" w:color="D9D9D2"/>
+              <w:right w:val="single" w:sz="4" w:space="0" w:color="D9D9D2"/>
             </w:tcBorders>
             <w:shd w:color="auto" w:fill="CDD2B7" w:val="clear"/>
           </w:tcPr>
           <w:p>
             <w:pPr>
               <w:pStyle w:val="Normal"/>
-              <w:spacing w:lineRule="auto" w:line="252" w:before="0" w:after="0"/>
+              <w:spacing w:lineRule="auto" w:line="268" w:before="0" w:after="0"/>
               <w:rPr/>
             </w:pPr>
             <w:r>
@@ -428,16 +552,16 @@
           <w:tcPr>
             <w:tcW w:w="6689" w:type="dxa"/>
             <w:tcBorders>
-              <w:top w:val="single" w:sz="4" w:space="0" w:color="A89662"/>
-              <w:left w:val="single" w:sz="4" w:space="0" w:color="A89662"/>
-              <w:bottom w:val="single" w:sz="4" w:space="0" w:color="A89662"/>
+              <w:top w:val="single" w:sz="4" w:space="0" w:color="D9D9D2"/>
+              <w:left w:val="single" w:sz="4" w:space="0" w:color="D9D9D2"/>
+              <w:bottom w:val="single" w:sz="4" w:space="0" w:color="D9D9D2"/>
               <w:right w:val="single" w:sz="4" w:space="0" w:color="A89662"/>
             </w:tcBorders>
           </w:tcPr>
           <w:p>
             <w:pPr>
               <w:pStyle w:val="Normal"/>
-              <w:spacing w:lineRule="auto" w:line="252" w:before="0" w:after="0"/>
+              <w:spacing w:lineRule="auto" w:line="268" w:before="0" w:after="0"/>
               <w:rPr/>
             </w:pPr>
             <w:r>
@@ -445,7 +569,7 @@
                 <w:rFonts w:cs="Arial"/>
                 <w:b w:val="false"/>
                 <w:i w:val="false"/>
-                <w:sz w:val="20"/>
+                <w:sz w:val="19"/>
               </w:rPr>
               <w:t>Army</w:t>
             </w:r>
@@ -460,17 +584,17 @@
           <w:tcPr>
             <w:tcW w:w="2608" w:type="dxa"/>
             <w:tcBorders>
-              <w:top w:val="single" w:sz="4" w:space="0" w:color="A89662"/>
+              <w:top w:val="single" w:sz="4" w:space="0" w:color="D9D9D2"/>
               <w:left w:val="single" w:sz="4" w:space="0" w:color="A89662"/>
-              <w:bottom w:val="single" w:sz="4" w:space="0" w:color="A89662"/>
-              <w:right w:val="single" w:sz="4" w:space="0" w:color="A89662"/>
+              <w:bottom w:val="single" w:sz="4" w:space="0" w:color="D9D9D2"/>
+              <w:right w:val="single" w:sz="4" w:space="0" w:color="D9D9D2"/>
             </w:tcBorders>
             <w:shd w:color="auto" w:fill="CDD2B7" w:val="clear"/>
           </w:tcPr>
           <w:p>
             <w:pPr>
               <w:pStyle w:val="Normal"/>
-              <w:spacing w:lineRule="auto" w:line="252" w:before="0" w:after="0"/>
+              <w:spacing w:lineRule="auto" w:line="268" w:before="0" w:after="0"/>
               <w:rPr/>
             </w:pPr>
             <w:r>
@@ -489,16 +613,16 @@
           <w:tcPr>
             <w:tcW w:w="6689" w:type="dxa"/>
             <w:tcBorders>
-              <w:top w:val="single" w:sz="4" w:space="0" w:color="A89662"/>
-              <w:left w:val="single" w:sz="4" w:space="0" w:color="A89662"/>
-              <w:bottom w:val="single" w:sz="4" w:space="0" w:color="A89662"/>
+              <w:top w:val="single" w:sz="4" w:space="0" w:color="D9D9D2"/>
+              <w:left w:val="single" w:sz="4" w:space="0" w:color="D9D9D2"/>
+              <w:bottom w:val="single" w:sz="4" w:space="0" w:color="D9D9D2"/>
               <w:right w:val="single" w:sz="4" w:space="0" w:color="A89662"/>
             </w:tcBorders>
           </w:tcPr>
           <w:p>
             <w:pPr>
               <w:pStyle w:val="Normal"/>
-              <w:spacing w:lineRule="auto" w:line="252" w:before="0" w:after="0"/>
+              <w:spacing w:lineRule="auto" w:line="268" w:before="0" w:after="0"/>
               <w:rPr/>
             </w:pPr>
             <w:r>
@@ -506,7 +630,7 @@
                 <w:rFonts w:cs="Arial"/>
                 <w:b w:val="false"/>
                 <w:i w:val="false"/>
-                <w:sz w:val="20"/>
+                <w:sz w:val="19"/>
               </w:rPr>
               <w:t>New Zealand Army Leadership Centre (NZALC)</w:t>
             </w:r>
@@ -521,17 +645,17 @@
           <w:tcPr>
             <w:tcW w:w="2608" w:type="dxa"/>
             <w:tcBorders>
-              <w:top w:val="single" w:sz="4" w:space="0" w:color="A89662"/>
+              <w:top w:val="single" w:sz="4" w:space="0" w:color="D9D9D2"/>
               <w:left w:val="single" w:sz="4" w:space="0" w:color="A89662"/>
-              <w:bottom w:val="single" w:sz="4" w:space="0" w:color="A89662"/>
-              <w:right w:val="single" w:sz="4" w:space="0" w:color="A89662"/>
+              <w:bottom w:val="single" w:sz="4" w:space="0" w:color="D9D9D2"/>
+              <w:right w:val="single" w:sz="4" w:space="0" w:color="D9D9D2"/>
             </w:tcBorders>
             <w:shd w:color="auto" w:fill="CDD2B7" w:val="clear"/>
           </w:tcPr>
           <w:p>
             <w:pPr>
               <w:pStyle w:val="Normal"/>
-              <w:spacing w:lineRule="auto" w:line="252" w:before="0" w:after="0"/>
+              <w:spacing w:lineRule="auto" w:line="268" w:before="0" w:after="0"/>
               <w:rPr/>
             </w:pPr>
             <w:r>
@@ -550,16 +674,16 @@
           <w:tcPr>
             <w:tcW w:w="6689" w:type="dxa"/>
             <w:tcBorders>
-              <w:top w:val="single" w:sz="4" w:space="0" w:color="A89662"/>
-              <w:left w:val="single" w:sz="4" w:space="0" w:color="A89662"/>
-              <w:bottom w:val="single" w:sz="4" w:space="0" w:color="A89662"/>
+              <w:top w:val="single" w:sz="4" w:space="0" w:color="D9D9D2"/>
+              <w:left w:val="single" w:sz="4" w:space="0" w:color="D9D9D2"/>
+              <w:bottom w:val="single" w:sz="4" w:space="0" w:color="D9D9D2"/>
               <w:right w:val="single" w:sz="4" w:space="0" w:color="A89662"/>
             </w:tcBorders>
           </w:tcPr>
           <w:p>
             <w:pPr>
               <w:pStyle w:val="Normal"/>
-              <w:spacing w:lineRule="auto" w:line="252" w:before="0" w:after="0"/>
+              <w:spacing w:lineRule="auto" w:line="268" w:before="0" w:after="0"/>
               <w:rPr/>
             </w:pPr>
             <w:r>
@@ -567,7 +691,7 @@
                 <w:rFonts w:cs="Arial"/>
                 <w:b w:val="false"/>
                 <w:i w:val="false"/>
-                <w:sz w:val="20"/>
+                <w:sz w:val="19"/>
               </w:rPr>
               <w:t>8–10 Training Days</w:t>
             </w:r>
@@ -582,17 +706,17 @@
           <w:tcPr>
             <w:tcW w:w="2608" w:type="dxa"/>
             <w:tcBorders>
-              <w:top w:val="single" w:sz="4" w:space="0" w:color="A89662"/>
+              <w:top w:val="single" w:sz="4" w:space="0" w:color="D9D9D2"/>
               <w:left w:val="single" w:sz="4" w:space="0" w:color="A89662"/>
-              <w:bottom w:val="single" w:sz="4" w:space="0" w:color="A89662"/>
-              <w:right w:val="single" w:sz="4" w:space="0" w:color="A89662"/>
+              <w:bottom w:val="single" w:sz="4" w:space="0" w:color="D9D9D2"/>
+              <w:right w:val="single" w:sz="4" w:space="0" w:color="D9D9D2"/>
             </w:tcBorders>
             <w:shd w:color="auto" w:fill="CDD2B7" w:val="clear"/>
           </w:tcPr>
           <w:p>
             <w:pPr>
               <w:pStyle w:val="Normal"/>
-              <w:spacing w:lineRule="auto" w:line="252" w:before="0" w:after="0"/>
+              <w:spacing w:lineRule="auto" w:line="268" w:before="0" w:after="0"/>
               <w:rPr/>
             </w:pPr>
             <w:r>
@@ -611,16 +735,16 @@
           <w:tcPr>
             <w:tcW w:w="6689" w:type="dxa"/>
             <w:tcBorders>
-              <w:top w:val="single" w:sz="4" w:space="0" w:color="A89662"/>
-              <w:left w:val="single" w:sz="4" w:space="0" w:color="A89662"/>
-              <w:bottom w:val="single" w:sz="4" w:space="0" w:color="A89662"/>
+              <w:top w:val="single" w:sz="4" w:space="0" w:color="D9D9D2"/>
+              <w:left w:val="single" w:sz="4" w:space="0" w:color="D9D9D2"/>
+              <w:bottom w:val="single" w:sz="4" w:space="0" w:color="D9D9D2"/>
               <w:right w:val="single" w:sz="4" w:space="0" w:color="A89662"/>
             </w:tcBorders>
           </w:tcPr>
           <w:p>
             <w:pPr>
               <w:pStyle w:val="Normal"/>
-              <w:spacing w:lineRule="auto" w:line="252" w:before="0" w:after="0"/>
+              <w:spacing w:lineRule="auto" w:line="268" w:before="0" w:after="0"/>
               <w:rPr/>
             </w:pPr>
             <w:r>
@@ -628,7 +752,7 @@
                 <w:rFonts w:cs="Arial"/>
                 <w:b w:val="false"/>
                 <w:i w:val="false"/>
-                <w:sz w:val="20"/>
+                <w:sz w:val="19"/>
               </w:rPr>
               <w:t>Face-to-Face</w:t>
             </w:r>
@@ -643,17 +767,17 @@
           <w:tcPr>
             <w:tcW w:w="2608" w:type="dxa"/>
             <w:tcBorders>
-              <w:top w:val="single" w:sz="4" w:space="0" w:color="A89662"/>
+              <w:top w:val="single" w:sz="4" w:space="0" w:color="D9D9D2"/>
               <w:left w:val="single" w:sz="4" w:space="0" w:color="A89662"/>
-              <w:bottom w:val="single" w:sz="4" w:space="0" w:color="A89662"/>
-              <w:right w:val="single" w:sz="4" w:space="0" w:color="A89662"/>
+              <w:bottom w:val="single" w:sz="4" w:space="0" w:color="D9D9D2"/>
+              <w:right w:val="single" w:sz="4" w:space="0" w:color="D9D9D2"/>
             </w:tcBorders>
             <w:shd w:color="auto" w:fill="CDD2B7" w:val="clear"/>
           </w:tcPr>
           <w:p>
             <w:pPr>
               <w:pStyle w:val="Normal"/>
-              <w:spacing w:lineRule="auto" w:line="252" w:before="0" w:after="0"/>
+              <w:spacing w:lineRule="auto" w:line="268" w:before="0" w:after="0"/>
               <w:rPr/>
             </w:pPr>
             <w:r>
@@ -672,16 +796,16 @@
           <w:tcPr>
             <w:tcW w:w="6689" w:type="dxa"/>
             <w:tcBorders>
-              <w:top w:val="single" w:sz="4" w:space="0" w:color="A89662"/>
-              <w:left w:val="single" w:sz="4" w:space="0" w:color="A89662"/>
-              <w:bottom w:val="single" w:sz="4" w:space="0" w:color="A89662"/>
+              <w:top w:val="single" w:sz="4" w:space="0" w:color="D9D9D2"/>
+              <w:left w:val="single" w:sz="4" w:space="0" w:color="D9D9D2"/>
+              <w:bottom w:val="single" w:sz="4" w:space="0" w:color="D9D9D2"/>
               <w:right w:val="single" w:sz="4" w:space="0" w:color="A89662"/>
             </w:tcBorders>
           </w:tcPr>
           <w:p>
             <w:pPr>
               <w:pStyle w:val="Normal"/>
-              <w:spacing w:lineRule="auto" w:line="252" w:before="0" w:after="0"/>
+              <w:spacing w:lineRule="auto" w:line="268" w:before="0" w:after="0"/>
               <w:rPr/>
             </w:pPr>
             <w:r>
@@ -689,7 +813,7 @@
                 <w:rFonts w:cs="Arial"/>
                 <w:b w:val="false"/>
                 <w:i w:val="false"/>
-                <w:sz w:val="20"/>
+                <w:sz w:val="19"/>
               </w:rPr>
               <w:t>The aim of ELDA Command is to develop command effectiveness by enhancing self-awareness, judgement and deliberate leadership behaviour, enabling learners to create the conditions for effective team and organisational performance in complex and demanding environments.</w:t>
             </w:r>
@@ -704,17 +828,17 @@
           <w:tcPr>
             <w:tcW w:w="2608" w:type="dxa"/>
             <w:tcBorders>
-              <w:top w:val="single" w:sz="4" w:space="0" w:color="A89662"/>
+              <w:top w:val="single" w:sz="4" w:space="0" w:color="D9D9D2"/>
               <w:left w:val="single" w:sz="4" w:space="0" w:color="A89662"/>
-              <w:bottom w:val="single" w:sz="4" w:space="0" w:color="A89662"/>
-              <w:right w:val="single" w:sz="4" w:space="0" w:color="A89662"/>
+              <w:bottom w:val="single" w:sz="4" w:space="0" w:color="D9D9D2"/>
+              <w:right w:val="single" w:sz="4" w:space="0" w:color="D9D9D2"/>
             </w:tcBorders>
             <w:shd w:color="auto" w:fill="CDD2B7" w:val="clear"/>
           </w:tcPr>
           <w:p>
             <w:pPr>
               <w:pStyle w:val="Normal"/>
-              <w:spacing w:lineRule="auto" w:line="252" w:before="0" w:after="0"/>
+              <w:spacing w:lineRule="auto" w:line="268" w:before="0" w:after="0"/>
               <w:rPr/>
             </w:pPr>
             <w:r>
@@ -733,16 +857,16 @@
           <w:tcPr>
             <w:tcW w:w="6689" w:type="dxa"/>
             <w:tcBorders>
-              <w:top w:val="single" w:sz="4" w:space="0" w:color="A89662"/>
-              <w:left w:val="single" w:sz="4" w:space="0" w:color="A89662"/>
-              <w:bottom w:val="single" w:sz="4" w:space="0" w:color="A89662"/>
+              <w:top w:val="single" w:sz="4" w:space="0" w:color="D9D9D2"/>
+              <w:left w:val="single" w:sz="4" w:space="0" w:color="D9D9D2"/>
+              <w:bottom w:val="single" w:sz="4" w:space="0" w:color="D9D9D2"/>
               <w:right w:val="single" w:sz="4" w:space="0" w:color="A89662"/>
             </w:tcBorders>
           </w:tcPr>
           <w:p>
             <w:pPr>
               <w:pStyle w:val="Normal"/>
-              <w:spacing w:lineRule="auto" w:line="252" w:before="0" w:after="0"/>
+              <w:spacing w:lineRule="auto" w:line="268" w:before="0" w:after="0"/>
               <w:rPr/>
             </w:pPr>
             <w:r>
@@ -750,7 +874,7 @@
                 <w:rFonts w:cs="Arial"/>
                 <w:b w:val="false"/>
                 <w:i w:val="false"/>
-                <w:sz w:val="20"/>
+                <w:sz w:val="19"/>
               </w:rPr>
               <w:t>Retain the existing DLMS qualifications/certifications, subject to confirmation that these accurately represent the qualification or certification awarded:</w:t>
             </w:r>
@@ -763,7 +887,7 @@
                 <w:rFonts w:cs="Arial"/>
                 <w:b w:val="false"/>
                 <w:i w:val="false"/>
-                <w:sz w:val="20"/>
+                <w:sz w:val="19"/>
               </w:rPr>
               <w:t>• AA18001 ELDA Alpine Touring</w:t>
             </w:r>
@@ -776,7 +900,7 @@
                 <w:rFonts w:cs="Arial"/>
                 <w:b w:val="false"/>
                 <w:i w:val="false"/>
-                <w:sz w:val="20"/>
+                <w:sz w:val="19"/>
               </w:rPr>
               <w:t>• AA18002 ELDA Rock Climbing</w:t>
             </w:r>
@@ -789,7 +913,7 @@
                 <w:rFonts w:cs="Arial"/>
                 <w:b w:val="false"/>
                 <w:i w:val="false"/>
-                <w:sz w:val="20"/>
+                <w:sz w:val="19"/>
               </w:rPr>
               <w:t>• AA18003 ELDA Sea Kayaking</w:t>
             </w:r>
@@ -802,7 +926,7 @@
                 <w:rFonts w:cs="Arial"/>
                 <w:b w:val="false"/>
                 <w:i w:val="false"/>
-                <w:sz w:val="20"/>
+                <w:sz w:val="19"/>
               </w:rPr>
               <w:t>• AA18004 ELDA White Water Kayaking</w:t>
             </w:r>
@@ -815,7 +939,7 @@
                 <w:rFonts w:cs="Arial"/>
                 <w:b w:val="false"/>
                 <w:i w:val="false"/>
-                <w:sz w:val="20"/>
+                <w:sz w:val="19"/>
               </w:rPr>
               <w:t>• AA18005 ELDA Wilderness</w:t>
             </w:r>
@@ -828,7 +952,7 @@
                 <w:rFonts w:cs="Arial"/>
                 <w:b w:val="false"/>
                 <w:i w:val="false"/>
-                <w:sz w:val="20"/>
+                <w:sz w:val="19"/>
               </w:rPr>
               <w:t>• AA18006 ELDA Cave</w:t>
             </w:r>
@@ -843,17 +967,17 @@
           <w:tcPr>
             <w:tcW w:w="2608" w:type="dxa"/>
             <w:tcBorders>
-              <w:top w:val="single" w:sz="4" w:space="0" w:color="A89662"/>
+              <w:top w:val="single" w:sz="4" w:space="0" w:color="D9D9D2"/>
               <w:left w:val="single" w:sz="4" w:space="0" w:color="A89662"/>
-              <w:bottom w:val="single" w:sz="4" w:space="0" w:color="A89662"/>
-              <w:right w:val="single" w:sz="4" w:space="0" w:color="A89662"/>
+              <w:bottom w:val="single" w:sz="4" w:space="0" w:color="D9D9D2"/>
+              <w:right w:val="single" w:sz="4" w:space="0" w:color="D9D9D2"/>
             </w:tcBorders>
             <w:shd w:color="auto" w:fill="CDD2B7" w:val="clear"/>
           </w:tcPr>
           <w:p>
             <w:pPr>
               <w:pStyle w:val="Normal"/>
-              <w:spacing w:lineRule="auto" w:line="252" w:before="0" w:after="0"/>
+              <w:spacing w:lineRule="auto" w:line="268" w:before="0" w:after="0"/>
               <w:rPr/>
             </w:pPr>
             <w:r>
@@ -872,16 +996,16 @@
           <w:tcPr>
             <w:tcW w:w="6689" w:type="dxa"/>
             <w:tcBorders>
-              <w:top w:val="single" w:sz="4" w:space="0" w:color="A89662"/>
-              <w:left w:val="single" w:sz="4" w:space="0" w:color="A89662"/>
-              <w:bottom w:val="single" w:sz="4" w:space="0" w:color="A89662"/>
+              <w:top w:val="single" w:sz="4" w:space="0" w:color="D9D9D2"/>
+              <w:left w:val="single" w:sz="4" w:space="0" w:color="D9D9D2"/>
+              <w:bottom w:val="single" w:sz="4" w:space="0" w:color="D9D9D2"/>
               <w:right w:val="single" w:sz="4" w:space="0" w:color="A89662"/>
             </w:tcBorders>
           </w:tcPr>
           <w:p>
             <w:pPr>
               <w:pStyle w:val="Normal"/>
-              <w:spacing w:lineRule="auto" w:line="252" w:before="0" w:after="0"/>
+              <w:spacing w:lineRule="auto" w:line="268" w:before="0" w:after="0"/>
               <w:rPr/>
             </w:pPr>
             <w:r>
@@ -889,7 +1013,7 @@
                 <w:rFonts w:cs="Arial"/>
                 <w:b w:val="false"/>
                 <w:i w:val="false"/>
-                <w:sz w:val="20"/>
+                <w:sz w:val="19"/>
               </w:rPr>
               <w:t>1. Personnel selected for, preparing for, or currently undertaking significant command or senior leadership appointments.</w:t>
             </w:r>
@@ -902,7 +1026,7 @@
                 <w:rFonts w:cs="Arial"/>
                 <w:b w:val="false"/>
                 <w:i w:val="false"/>
-                <w:sz w:val="20"/>
+                <w:sz w:val="19"/>
               </w:rPr>
               <w:t>2. Other personnel identified as requiring command-level experiential leadership development, as determined by the Learning Provider and relevant career management authority.</w:t>
             </w:r>
@@ -917,17 +1041,17 @@
           <w:tcPr>
             <w:tcW w:w="2608" w:type="dxa"/>
             <w:tcBorders>
-              <w:top w:val="single" w:sz="4" w:space="0" w:color="A89662"/>
+              <w:top w:val="single" w:sz="4" w:space="0" w:color="D9D9D2"/>
               <w:left w:val="single" w:sz="4" w:space="0" w:color="A89662"/>
-              <w:bottom w:val="single" w:sz="4" w:space="0" w:color="A89662"/>
-              <w:right w:val="single" w:sz="4" w:space="0" w:color="A89662"/>
+              <w:bottom w:val="single" w:sz="4" w:space="0" w:color="D9D9D2"/>
+              <w:right w:val="single" w:sz="4" w:space="0" w:color="D9D9D2"/>
             </w:tcBorders>
             <w:shd w:color="auto" w:fill="CDD2B7" w:val="clear"/>
           </w:tcPr>
           <w:p>
             <w:pPr>
               <w:pStyle w:val="Normal"/>
-              <w:spacing w:lineRule="auto" w:line="252" w:before="0" w:after="0"/>
+              <w:spacing w:lineRule="auto" w:line="268" w:before="0" w:after="0"/>
               <w:rPr/>
             </w:pPr>
             <w:r>
@@ -946,16 +1070,16 @@
           <w:tcPr>
             <w:tcW w:w="6689" w:type="dxa"/>
             <w:tcBorders>
-              <w:top w:val="single" w:sz="4" w:space="0" w:color="A89662"/>
-              <w:left w:val="single" w:sz="4" w:space="0" w:color="A89662"/>
-              <w:bottom w:val="single" w:sz="4" w:space="0" w:color="A89662"/>
+              <w:top w:val="single" w:sz="4" w:space="0" w:color="D9D9D2"/>
+              <w:left w:val="single" w:sz="4" w:space="0" w:color="D9D9D2"/>
+              <w:bottom w:val="single" w:sz="4" w:space="0" w:color="D9D9D2"/>
               <w:right w:val="single" w:sz="4" w:space="0" w:color="A89662"/>
             </w:tcBorders>
           </w:tcPr>
           <w:p>
             <w:pPr>
               <w:pStyle w:val="Normal"/>
-              <w:spacing w:lineRule="auto" w:line="252" w:before="0" w:after="0"/>
+              <w:spacing w:lineRule="auto" w:line="268" w:before="0" w:after="0"/>
               <w:rPr/>
             </w:pPr>
             <w:r>
@@ -963,7 +1087,7 @@
                 <w:rFonts w:cs="Arial"/>
                 <w:b w:val="false"/>
                 <w:i w:val="false"/>
-                <w:sz w:val="20"/>
+                <w:sz w:val="19"/>
               </w:rPr>
               <w:t>Learners will be able to evaluate how their judgement and leadership behaviour affect people, teams and organisational outcomes, and deliberately shape the conditions required for effective performance in complex and demanding contexts.</w:t>
             </w:r>
@@ -978,17 +1102,17 @@
           <w:tcPr>
             <w:tcW w:w="2608" w:type="dxa"/>
             <w:tcBorders>
-              <w:top w:val="single" w:sz="4" w:space="0" w:color="A89662"/>
+              <w:top w:val="single" w:sz="4" w:space="0" w:color="D9D9D2"/>
               <w:left w:val="single" w:sz="4" w:space="0" w:color="A89662"/>
               <w:bottom w:val="single" w:sz="4" w:space="0" w:color="A89662"/>
-              <w:right w:val="single" w:sz="4" w:space="0" w:color="A89662"/>
+              <w:right w:val="single" w:sz="4" w:space="0" w:color="D9D9D2"/>
             </w:tcBorders>
             <w:shd w:color="auto" w:fill="CDD2B7" w:val="clear"/>
           </w:tcPr>
           <w:p>
             <w:pPr>
               <w:pStyle w:val="Normal"/>
-              <w:spacing w:lineRule="auto" w:line="252" w:before="0" w:after="0"/>
+              <w:spacing w:lineRule="auto" w:line="268" w:before="0" w:after="0"/>
               <w:rPr/>
             </w:pPr>
             <w:r>
@@ -1007,8 +1131,8 @@
           <w:tcPr>
             <w:tcW w:w="6689" w:type="dxa"/>
             <w:tcBorders>
-              <w:top w:val="single" w:sz="4" w:space="0" w:color="A89662"/>
-              <w:left w:val="single" w:sz="4" w:space="0" w:color="A89662"/>
+              <w:top w:val="single" w:sz="4" w:space="0" w:color="D9D9D2"/>
+              <w:left w:val="single" w:sz="4" w:space="0" w:color="D9D9D2"/>
               <w:bottom w:val="single" w:sz="4" w:space="0" w:color="A89662"/>
               <w:right w:val="single" w:sz="4" w:space="0" w:color="A89662"/>
             </w:tcBorders>
@@ -1016,7 +1140,7 @@
           <w:p>
             <w:pPr>
               <w:pStyle w:val="Normal"/>
-              <w:spacing w:lineRule="auto" w:line="252" w:before="0" w:after="0"/>
+              <w:spacing w:lineRule="auto" w:line="268" w:before="0" w:after="0"/>
               <w:rPr/>
             </w:pPr>
             <w:r>
@@ -1024,7 +1148,7 @@
                 <w:rFonts w:cs="Arial"/>
                 <w:b w:val="false"/>
                 <w:i w:val="false"/>
-                <w:sz w:val="20"/>
+                <w:sz w:val="19"/>
               </w:rPr>
               <w:t>1. Apply the insights and strategies developed through ELDA Command within current and future command and senior leadership appointments.</w:t>
             </w:r>
@@ -1037,7 +1161,7 @@
                 <w:rFonts w:cs="Arial"/>
                 <w:b w:val="false"/>
                 <w:i w:val="false"/>
-                <w:sz w:val="20"/>
+                <w:sz w:val="19"/>
               </w:rPr>
               <w:t>2. Continue deliberate reflection, feedback and adaptation of command behaviour as context, responsibility and organisational complexity change.</w:t>
             </w:r>
@@ -1050,7 +1174,7 @@
                 <w:rFonts w:cs="Arial"/>
                 <w:b w:val="false"/>
                 <w:i w:val="false"/>
-                <w:sz w:val="20"/>
+                <w:sz w:val="19"/>
               </w:rPr>
               <w:t>3. Review and update the individual Leadership Development Plan (LDP) to reflect emerging command and leadership development priorities.</w:t>
             </w:r>
@@ -1061,7 +1185,7 @@
     <w:p>
       <w:pPr>
         <w:pStyle w:val="Normal"/>
-        <w:spacing w:before="0" w:after="80"/>
+        <w:spacing w:before="0" w:after="120"/>
         <w:rPr/>
       </w:pPr>
       <w:r>
@@ -1079,7 +1203,7 @@
           <w:b/>
           <w:i w:val="false"/>
           <w:color w:val="002516"/>
-          <w:sz w:val="24"/>
+          <w:sz w:val="25"/>
         </w:rPr>
         <w:t>Course Entry Requirements</w:t>
       </w:r>
@@ -1127,7 +1251,7 @@
         <w:rPr>
           <w:rFonts w:cs="Arial"/>
           <w:b/>
-          <w:color w:val="C62026"/>
+          <w:color w:val="002516"/>
         </w:rPr>
         <w:t>•</w:t>
       </w:r>
@@ -1135,7 +1259,7 @@
         <w:rPr>
           <w:rFonts w:cs="Arial"/>
           <w:b/>
-          <w:color w:val="C62026"/>
+          <w:color w:val="002516"/>
         </w:rPr>
         <w:tab/>
       </w:r>
@@ -1163,7 +1287,7 @@
         <w:rPr>
           <w:rFonts w:cs="Arial"/>
           <w:b/>
-          <w:color w:val="C62026"/>
+          <w:color w:val="002516"/>
         </w:rPr>
         <w:t>•</w:t>
       </w:r>
@@ -1171,7 +1295,7 @@
         <w:rPr>
           <w:rFonts w:cs="Arial"/>
           <w:b/>
-          <w:color w:val="C62026"/>
+          <w:color w:val="002516"/>
         </w:rPr>
         <w:tab/>
       </w:r>
@@ -1188,7 +1312,7 @@
       <w:pPr>
         <w:pStyle w:val="Normal"/>
         <w:keepNext w:val="true"/>
-        <w:spacing w:before="160" w:after="60"/>
+        <w:spacing w:before="240" w:after="80"/>
         <w:rPr/>
       </w:pPr>
       <w:r>
@@ -1230,7 +1354,7 @@
       <w:r>
         <w:rPr>
           <w:rFonts w:cs="Arial"/>
-          <w:b w:val="false"/>
+          <w:color w:val="000000"/>
         </w:rPr>
         <w:t>1.</w:t>
         <w:tab/>
@@ -1258,7 +1382,7 @@
       <w:r>
         <w:rPr>
           <w:rFonts w:cs="Arial"/>
-          <w:b w:val="false"/>
+          <w:color w:val="000000"/>
         </w:rPr>
         <w:t>2.</w:t>
         <w:tab/>
@@ -1290,13 +1414,13 @@
       <w:tblPr>
         <w:tblW w:w="9298" w:type="dxa"/>
         <w:jc w:val="left"/>
-        <w:tblInd w:w="-8" w:type="dxa"/>
+        <w:tblInd w:w="2" w:type="dxa"/>
         <w:tblLayout w:type="fixed"/>
         <w:tblCellMar>
           <w:top w:w="60" w:type="dxa"/>
-          <w:left w:w="100" w:type="dxa"/>
+          <w:left w:w="110" w:type="dxa"/>
           <w:bottom w:w="60" w:type="dxa"/>
-          <w:right w:w="100" w:type="dxa"/>
+          <w:right w:w="110" w:type="dxa"/>
         </w:tblCellMar>
         <w:tblLook w:val="04a0" w:noHBand="0" w:noVBand="1" w:firstColumn="1" w:lastRow="0" w:lastColumn="0" w:firstRow="1"/>
       </w:tblPr>
@@ -1314,8 +1438,8 @@
             <w:tcBorders>
               <w:top w:val="single" w:sz="4" w:space="0" w:color="A89662"/>
               <w:left w:val="single" w:sz="4" w:space="0" w:color="A89662"/>
-              <w:bottom w:val="single" w:sz="4" w:space="0" w:color="A89662"/>
-              <w:right w:val="single" w:sz="4" w:space="0" w:color="A89662"/>
+              <w:bottom w:val="single" w:sz="4" w:space="0" w:color="D9D9D2"/>
+              <w:right w:val="single" w:sz="4" w:space="0" w:color="D9D9D2"/>
             </w:tcBorders>
             <w:shd w:color="auto" w:fill="002516" w:val="clear"/>
           </w:tcPr>
@@ -1323,7 +1447,7 @@
             <w:pPr>
               <w:pStyle w:val="Normal"/>
               <w:keepNext w:val="true"/>
-              <w:spacing w:lineRule="auto" w:line="252" w:before="0" w:after="0"/>
+              <w:spacing w:lineRule="auto" w:line="268" w:before="0" w:after="0"/>
               <w:rPr/>
             </w:pPr>
             <w:r>
@@ -1343,8 +1467,8 @@
             <w:tcW w:w="6689" w:type="dxa"/>
             <w:tcBorders>
               <w:top w:val="single" w:sz="4" w:space="0" w:color="A89662"/>
-              <w:left w:val="single" w:sz="4" w:space="0" w:color="A89662"/>
-              <w:bottom w:val="single" w:sz="4" w:space="0" w:color="A89662"/>
+              <w:left w:val="single" w:sz="4" w:space="0" w:color="D9D9D2"/>
+              <w:bottom w:val="single" w:sz="4" w:space="0" w:color="D9D9D2"/>
               <w:right w:val="single" w:sz="4" w:space="0" w:color="A89662"/>
             </w:tcBorders>
             <w:shd w:color="auto" w:fill="002516" w:val="clear"/>
@@ -1353,7 +1477,7 @@
             <w:pPr>
               <w:pStyle w:val="Normal"/>
               <w:keepNext w:val="true"/>
-              <w:spacing w:lineRule="auto" w:line="252" w:before="0" w:after="0"/>
+              <w:spacing w:lineRule="auto" w:line="268" w:before="0" w:after="0"/>
               <w:rPr/>
             </w:pPr>
             <w:r>
@@ -1377,10 +1501,10 @@
           <w:tcPr>
             <w:tcW w:w="2608" w:type="dxa"/>
             <w:tcBorders>
-              <w:top w:val="single" w:sz="4" w:space="0" w:color="A89662"/>
+              <w:top w:val="single" w:sz="4" w:space="0" w:color="D9D9D2"/>
               <w:left w:val="single" w:sz="4" w:space="0" w:color="A89662"/>
-              <w:bottom w:val="single" w:sz="4" w:space="0" w:color="A89662"/>
-              <w:right w:val="single" w:sz="4" w:space="0" w:color="A89662"/>
+              <w:bottom w:val="single" w:sz="4" w:space="0" w:color="D9D9D2"/>
+              <w:right w:val="single" w:sz="4" w:space="0" w:color="D9D9D2"/>
             </w:tcBorders>
             <w:shd w:color="auto" w:fill="CDD2B7" w:val="clear"/>
           </w:tcPr>
@@ -1388,7 +1512,7 @@
             <w:pPr>
               <w:pStyle w:val="Normal"/>
               <w:keepNext w:val="true"/>
-              <w:spacing w:lineRule="auto" w:line="252" w:before="0" w:after="0"/>
+              <w:spacing w:lineRule="auto" w:line="268" w:before="0" w:after="0"/>
               <w:rPr/>
             </w:pPr>
             <w:r>
@@ -1407,9 +1531,9 @@
           <w:tcPr>
             <w:tcW w:w="6689" w:type="dxa"/>
             <w:tcBorders>
-              <w:top w:val="single" w:sz="4" w:space="0" w:color="A89662"/>
-              <w:left w:val="single" w:sz="4" w:space="0" w:color="A89662"/>
-              <w:bottom w:val="single" w:sz="4" w:space="0" w:color="A89662"/>
+              <w:top w:val="single" w:sz="4" w:space="0" w:color="D9D9D2"/>
+              <w:left w:val="single" w:sz="4" w:space="0" w:color="D9D9D2"/>
+              <w:bottom w:val="single" w:sz="4" w:space="0" w:color="D9D9D2"/>
               <w:right w:val="single" w:sz="4" w:space="0" w:color="A89662"/>
             </w:tcBorders>
           </w:tcPr>
@@ -1417,7 +1541,7 @@
             <w:pPr>
               <w:pStyle w:val="Normal"/>
               <w:keepNext w:val="true"/>
-              <w:spacing w:lineRule="auto" w:line="252" w:before="0" w:after="0"/>
+              <w:spacing w:lineRule="auto" w:line="268" w:before="0" w:after="0"/>
               <w:rPr/>
             </w:pPr>
             <w:r>
@@ -1425,7 +1549,7 @@
                 <w:rFonts w:cs="Arial"/>
                 <w:b w:val="false"/>
                 <w:i w:val="false"/>
-                <w:sz w:val="20"/>
+                <w:sz w:val="19"/>
               </w:rPr>
               <w:t>N/A</w:t>
             </w:r>
@@ -1440,10 +1564,10 @@
           <w:tcPr>
             <w:tcW w:w="2608" w:type="dxa"/>
             <w:tcBorders>
-              <w:top w:val="single" w:sz="4" w:space="0" w:color="A89662"/>
+              <w:top w:val="single" w:sz="4" w:space="0" w:color="D9D9D2"/>
               <w:left w:val="single" w:sz="4" w:space="0" w:color="A89662"/>
-              <w:bottom w:val="single" w:sz="4" w:space="0" w:color="A89662"/>
-              <w:right w:val="single" w:sz="4" w:space="0" w:color="A89662"/>
+              <w:bottom w:val="single" w:sz="4" w:space="0" w:color="D9D9D2"/>
+              <w:right w:val="single" w:sz="4" w:space="0" w:color="D9D9D2"/>
             </w:tcBorders>
             <w:shd w:color="auto" w:fill="CDD2B7" w:val="clear"/>
           </w:tcPr>
@@ -1451,7 +1575,7 @@
             <w:pPr>
               <w:pStyle w:val="Normal"/>
               <w:keepNext w:val="true"/>
-              <w:spacing w:lineRule="auto" w:line="252" w:before="0" w:after="0"/>
+              <w:spacing w:lineRule="auto" w:line="268" w:before="0" w:after="0"/>
               <w:rPr/>
             </w:pPr>
             <w:r>
@@ -1470,9 +1594,9 @@
           <w:tcPr>
             <w:tcW w:w="6689" w:type="dxa"/>
             <w:tcBorders>
-              <w:top w:val="single" w:sz="4" w:space="0" w:color="A89662"/>
-              <w:left w:val="single" w:sz="4" w:space="0" w:color="A89662"/>
-              <w:bottom w:val="single" w:sz="4" w:space="0" w:color="A89662"/>
+              <w:top w:val="single" w:sz="4" w:space="0" w:color="D9D9D2"/>
+              <w:left w:val="single" w:sz="4" w:space="0" w:color="D9D9D2"/>
+              <w:bottom w:val="single" w:sz="4" w:space="0" w:color="D9D9D2"/>
               <w:right w:val="single" w:sz="4" w:space="0" w:color="A89662"/>
             </w:tcBorders>
           </w:tcPr>
@@ -1480,7 +1604,7 @@
             <w:pPr>
               <w:pStyle w:val="Normal"/>
               <w:keepNext w:val="true"/>
-              <w:spacing w:lineRule="auto" w:line="252" w:before="0" w:after="0"/>
+              <w:spacing w:lineRule="auto" w:line="268" w:before="0" w:after="0"/>
               <w:rPr/>
             </w:pPr>
             <w:r>
@@ -1488,7 +1612,7 @@
                 <w:rFonts w:cs="Arial"/>
                 <w:b w:val="false"/>
                 <w:i w:val="false"/>
-                <w:sz w:val="20"/>
+                <w:sz w:val="19"/>
               </w:rPr>
               <w:t>Minimum: 5</w:t>
             </w:r>
@@ -1501,7 +1625,7 @@
                 <w:rFonts w:cs="Arial"/>
                 <w:b w:val="false"/>
                 <w:i w:val="false"/>
-                <w:sz w:val="20"/>
+                <w:sz w:val="19"/>
               </w:rPr>
               <w:t>Maximum: 8</w:t>
             </w:r>
@@ -1516,10 +1640,10 @@
           <w:tcPr>
             <w:tcW w:w="2608" w:type="dxa"/>
             <w:tcBorders>
-              <w:top w:val="single" w:sz="4" w:space="0" w:color="A89662"/>
+              <w:top w:val="single" w:sz="4" w:space="0" w:color="D9D9D2"/>
               <w:left w:val="single" w:sz="4" w:space="0" w:color="A89662"/>
-              <w:bottom w:val="single" w:sz="4" w:space="0" w:color="A89662"/>
-              <w:right w:val="single" w:sz="4" w:space="0" w:color="A89662"/>
+              <w:bottom w:val="single" w:sz="4" w:space="0" w:color="D9D9D2"/>
+              <w:right w:val="single" w:sz="4" w:space="0" w:color="D9D9D2"/>
             </w:tcBorders>
             <w:shd w:color="auto" w:fill="CDD2B7" w:val="clear"/>
           </w:tcPr>
@@ -1527,7 +1651,7 @@
             <w:pPr>
               <w:pStyle w:val="Normal"/>
               <w:keepNext w:val="true"/>
-              <w:spacing w:lineRule="auto" w:line="252" w:before="0" w:after="0"/>
+              <w:spacing w:lineRule="auto" w:line="268" w:before="0" w:after="0"/>
               <w:rPr/>
             </w:pPr>
             <w:r>
@@ -1546,9 +1670,9 @@
           <w:tcPr>
             <w:tcW w:w="6689" w:type="dxa"/>
             <w:tcBorders>
-              <w:top w:val="single" w:sz="4" w:space="0" w:color="A89662"/>
-              <w:left w:val="single" w:sz="4" w:space="0" w:color="A89662"/>
-              <w:bottom w:val="single" w:sz="4" w:space="0" w:color="A89662"/>
+              <w:top w:val="single" w:sz="4" w:space="0" w:color="D9D9D2"/>
+              <w:left w:val="single" w:sz="4" w:space="0" w:color="D9D9D2"/>
+              <w:bottom w:val="single" w:sz="4" w:space="0" w:color="D9D9D2"/>
               <w:right w:val="single" w:sz="4" w:space="0" w:color="A89662"/>
             </w:tcBorders>
           </w:tcPr>
@@ -1556,7 +1680,7 @@
             <w:pPr>
               <w:pStyle w:val="Normal"/>
               <w:keepNext w:val="true"/>
-              <w:spacing w:lineRule="auto" w:line="252" w:before="0" w:after="0"/>
+              <w:spacing w:lineRule="auto" w:line="268" w:before="0" w:after="0"/>
               <w:rPr/>
             </w:pPr>
             <w:r>
@@ -1564,7 +1688,7 @@
                 <w:rFonts w:cs="Arial"/>
                 <w:b w:val="false"/>
                 <w:i w:val="false"/>
-                <w:sz w:val="20"/>
+                <w:sz w:val="19"/>
               </w:rPr>
               <w:t>N/A</w:t>
             </w:r>
@@ -1579,10 +1703,10 @@
           <w:tcPr>
             <w:tcW w:w="2608" w:type="dxa"/>
             <w:tcBorders>
-              <w:top w:val="single" w:sz="4" w:space="0" w:color="A89662"/>
+              <w:top w:val="single" w:sz="4" w:space="0" w:color="D9D9D2"/>
               <w:left w:val="single" w:sz="4" w:space="0" w:color="A89662"/>
-              <w:bottom w:val="single" w:sz="4" w:space="0" w:color="A89662"/>
-              <w:right w:val="single" w:sz="4" w:space="0" w:color="A89662"/>
+              <w:bottom w:val="single" w:sz="4" w:space="0" w:color="D9D9D2"/>
+              <w:right w:val="single" w:sz="4" w:space="0" w:color="D9D9D2"/>
             </w:tcBorders>
             <w:shd w:color="auto" w:fill="CDD2B7" w:val="clear"/>
           </w:tcPr>
@@ -1590,7 +1714,7 @@
             <w:pPr>
               <w:pStyle w:val="Normal"/>
               <w:keepNext w:val="true"/>
-              <w:spacing w:lineRule="auto" w:line="252" w:before="0" w:after="0"/>
+              <w:spacing w:lineRule="auto" w:line="268" w:before="0" w:after="0"/>
               <w:rPr/>
             </w:pPr>
             <w:r>
@@ -1609,9 +1733,9 @@
           <w:tcPr>
             <w:tcW w:w="6689" w:type="dxa"/>
             <w:tcBorders>
-              <w:top w:val="single" w:sz="4" w:space="0" w:color="A89662"/>
-              <w:left w:val="single" w:sz="4" w:space="0" w:color="A89662"/>
-              <w:bottom w:val="single" w:sz="4" w:space="0" w:color="A89662"/>
+              <w:top w:val="single" w:sz="4" w:space="0" w:color="D9D9D2"/>
+              <w:left w:val="single" w:sz="4" w:space="0" w:color="D9D9D2"/>
+              <w:bottom w:val="single" w:sz="4" w:space="0" w:color="D9D9D2"/>
               <w:right w:val="single" w:sz="4" w:space="0" w:color="A89662"/>
             </w:tcBorders>
           </w:tcPr>
@@ -1619,7 +1743,7 @@
             <w:pPr>
               <w:pStyle w:val="Normal"/>
               <w:keepNext w:val="true"/>
-              <w:spacing w:lineRule="auto" w:line="252" w:before="0" w:after="0"/>
+              <w:spacing w:lineRule="auto" w:line="268" w:before="0" w:after="0"/>
               <w:rPr/>
             </w:pPr>
             <w:r>
@@ -1627,7 +1751,7 @@
                 <w:rFonts w:cs="Arial"/>
                 <w:b w:val="false"/>
                 <w:i w:val="false"/>
-                <w:sz w:val="20"/>
+                <w:sz w:val="19"/>
               </w:rPr>
               <w:t>N/A</w:t>
             </w:r>
@@ -1642,10 +1766,10 @@
           <w:tcPr>
             <w:tcW w:w="2608" w:type="dxa"/>
             <w:tcBorders>
-              <w:top w:val="single" w:sz="4" w:space="0" w:color="A89662"/>
+              <w:top w:val="single" w:sz="4" w:space="0" w:color="D9D9D2"/>
               <w:left w:val="single" w:sz="4" w:space="0" w:color="A89662"/>
-              <w:bottom w:val="single" w:sz="4" w:space="0" w:color="A89662"/>
-              <w:right w:val="single" w:sz="4" w:space="0" w:color="A89662"/>
+              <w:bottom w:val="single" w:sz="4" w:space="0" w:color="D9D9D2"/>
+              <w:right w:val="single" w:sz="4" w:space="0" w:color="D9D9D2"/>
             </w:tcBorders>
             <w:shd w:color="auto" w:fill="CDD2B7" w:val="clear"/>
           </w:tcPr>
@@ -1653,7 +1777,7 @@
             <w:pPr>
               <w:pStyle w:val="Normal"/>
               <w:keepNext w:val="true"/>
-              <w:spacing w:lineRule="auto" w:line="252" w:before="0" w:after="0"/>
+              <w:spacing w:lineRule="auto" w:line="268" w:before="0" w:after="0"/>
               <w:rPr/>
             </w:pPr>
             <w:r>
@@ -1672,9 +1796,9 @@
           <w:tcPr>
             <w:tcW w:w="6689" w:type="dxa"/>
             <w:tcBorders>
-              <w:top w:val="single" w:sz="4" w:space="0" w:color="A89662"/>
-              <w:left w:val="single" w:sz="4" w:space="0" w:color="A89662"/>
-              <w:bottom w:val="single" w:sz="4" w:space="0" w:color="A89662"/>
+              <w:top w:val="single" w:sz="4" w:space="0" w:color="D9D9D2"/>
+              <w:left w:val="single" w:sz="4" w:space="0" w:color="D9D9D2"/>
+              <w:bottom w:val="single" w:sz="4" w:space="0" w:color="D9D9D2"/>
               <w:right w:val="single" w:sz="4" w:space="0" w:color="A89662"/>
             </w:tcBorders>
           </w:tcPr>
@@ -1682,7 +1806,7 @@
             <w:pPr>
               <w:pStyle w:val="Normal"/>
               <w:keepNext w:val="true"/>
-              <w:spacing w:lineRule="auto" w:line="252" w:before="0" w:after="0"/>
+              <w:spacing w:lineRule="auto" w:line="268" w:before="0" w:after="0"/>
               <w:rPr/>
             </w:pPr>
             <w:r>
@@ -1690,7 +1814,7 @@
                 <w:rFonts w:cs="Arial"/>
                 <w:b w:val="false"/>
                 <w:i w:val="false"/>
-                <w:sz w:val="20"/>
+                <w:sz w:val="19"/>
               </w:rPr>
               <w:t>Maximum number of NZDF Civilian learners: 2</w:t>
             </w:r>
@@ -1705,10 +1829,10 @@
           <w:tcPr>
             <w:tcW w:w="2608" w:type="dxa"/>
             <w:tcBorders>
-              <w:top w:val="single" w:sz="4" w:space="0" w:color="A89662"/>
+              <w:top w:val="single" w:sz="4" w:space="0" w:color="D9D9D2"/>
               <w:left w:val="single" w:sz="4" w:space="0" w:color="A89662"/>
-              <w:bottom w:val="single" w:sz="4" w:space="0" w:color="A89662"/>
-              <w:right w:val="single" w:sz="4" w:space="0" w:color="A89662"/>
+              <w:bottom w:val="single" w:sz="4" w:space="0" w:color="D9D9D2"/>
+              <w:right w:val="single" w:sz="4" w:space="0" w:color="D9D9D2"/>
             </w:tcBorders>
             <w:shd w:color="auto" w:fill="CDD2B7" w:val="clear"/>
           </w:tcPr>
@@ -1716,7 +1840,7 @@
             <w:pPr>
               <w:pStyle w:val="Normal"/>
               <w:keepNext w:val="true"/>
-              <w:spacing w:lineRule="auto" w:line="252" w:before="0" w:after="0"/>
+              <w:spacing w:lineRule="auto" w:line="268" w:before="0" w:after="0"/>
               <w:rPr/>
             </w:pPr>
             <w:r>
@@ -1735,9 +1859,9 @@
           <w:tcPr>
             <w:tcW w:w="6689" w:type="dxa"/>
             <w:tcBorders>
-              <w:top w:val="single" w:sz="4" w:space="0" w:color="A89662"/>
-              <w:left w:val="single" w:sz="4" w:space="0" w:color="A89662"/>
-              <w:bottom w:val="single" w:sz="4" w:space="0" w:color="A89662"/>
+              <w:top w:val="single" w:sz="4" w:space="0" w:color="D9D9D2"/>
+              <w:left w:val="single" w:sz="4" w:space="0" w:color="D9D9D2"/>
+              <w:bottom w:val="single" w:sz="4" w:space="0" w:color="D9D9D2"/>
               <w:right w:val="single" w:sz="4" w:space="0" w:color="A89662"/>
             </w:tcBorders>
           </w:tcPr>
@@ -1745,7 +1869,7 @@
             <w:pPr>
               <w:pStyle w:val="Normal"/>
               <w:keepNext w:val="true"/>
-              <w:spacing w:lineRule="auto" w:line="252" w:before="0" w:after="0"/>
+              <w:spacing w:lineRule="auto" w:line="268" w:before="0" w:after="0"/>
               <w:rPr/>
             </w:pPr>
             <w:r>
@@ -1753,7 +1877,7 @@
                 <w:rFonts w:cs="Arial"/>
                 <w:b w:val="false"/>
                 <w:i w:val="false"/>
-                <w:sz w:val="20"/>
+                <w:sz w:val="19"/>
               </w:rPr>
               <w:t>Maximum number of International (non-MAP) learners: 1</w:t>
             </w:r>
@@ -1768,17 +1892,17 @@
           <w:tcPr>
             <w:tcW w:w="2608" w:type="dxa"/>
             <w:tcBorders>
-              <w:top w:val="single" w:sz="4" w:space="0" w:color="A89662"/>
+              <w:top w:val="single" w:sz="4" w:space="0" w:color="D9D9D2"/>
               <w:left w:val="single" w:sz="4" w:space="0" w:color="A89662"/>
               <w:bottom w:val="single" w:sz="4" w:space="0" w:color="A89662"/>
-              <w:right w:val="single" w:sz="4" w:space="0" w:color="A89662"/>
+              <w:right w:val="single" w:sz="4" w:space="0" w:color="D9D9D2"/>
             </w:tcBorders>
             <w:shd w:color="auto" w:fill="CDD2B7" w:val="clear"/>
           </w:tcPr>
           <w:p>
             <w:pPr>
               <w:pStyle w:val="Normal"/>
-              <w:spacing w:lineRule="auto" w:line="252" w:before="0" w:after="0"/>
+              <w:spacing w:lineRule="auto" w:line="268" w:before="0" w:after="0"/>
               <w:rPr/>
             </w:pPr>
             <w:r>
@@ -1797,8 +1921,8 @@
           <w:tcPr>
             <w:tcW w:w="6689" w:type="dxa"/>
             <w:tcBorders>
-              <w:top w:val="single" w:sz="4" w:space="0" w:color="A89662"/>
-              <w:left w:val="single" w:sz="4" w:space="0" w:color="A89662"/>
+              <w:top w:val="single" w:sz="4" w:space="0" w:color="D9D9D2"/>
+              <w:left w:val="single" w:sz="4" w:space="0" w:color="D9D9D2"/>
               <w:bottom w:val="single" w:sz="4" w:space="0" w:color="A89662"/>
               <w:right w:val="single" w:sz="4" w:space="0" w:color="A89662"/>
             </w:tcBorders>
@@ -1806,7 +1930,7 @@
           <w:p>
             <w:pPr>
               <w:pStyle w:val="Normal"/>
-              <w:spacing w:lineRule="auto" w:line="252" w:before="0" w:after="0"/>
+              <w:spacing w:lineRule="auto" w:line="268" w:before="0" w:after="0"/>
               <w:rPr/>
             </w:pPr>
             <w:r>
@@ -1814,7 +1938,7 @@
                 <w:rFonts w:cs="Arial"/>
                 <w:b w:val="false"/>
                 <w:i w:val="false"/>
-                <w:sz w:val="20"/>
+                <w:sz w:val="19"/>
               </w:rPr>
               <w:t>Maximum number of non-NZDF learners: 1</w:t>
             </w:r>
@@ -1825,7 +1949,7 @@
     <w:p>
       <w:pPr>
         <w:pStyle w:val="Normal"/>
-        <w:spacing w:before="0" w:after="80"/>
+        <w:spacing w:before="0" w:after="120"/>
         <w:rPr/>
       </w:pPr>
       <w:r>
@@ -1843,7 +1967,7 @@
           <w:b/>
           <w:i w:val="false"/>
           <w:color w:val="002516"/>
-          <w:sz w:val="24"/>
+          <w:sz w:val="25"/>
         </w:rPr>
         <w:t>Governance and Delivery</w:t>
       </w:r>
@@ -1852,13 +1976,13 @@
       <w:tblPr>
         <w:tblW w:w="9298" w:type="dxa"/>
         <w:jc w:val="left"/>
-        <w:tblInd w:w="-8" w:type="dxa"/>
+        <w:tblInd w:w="2" w:type="dxa"/>
         <w:tblLayout w:type="fixed"/>
         <w:tblCellMar>
           <w:top w:w="60" w:type="dxa"/>
-          <w:left w:w="100" w:type="dxa"/>
+          <w:left w:w="110" w:type="dxa"/>
           <w:bottom w:w="60" w:type="dxa"/>
-          <w:right w:w="100" w:type="dxa"/>
+          <w:right w:w="110" w:type="dxa"/>
         </w:tblCellMar>
         <w:tblLook w:val="04a0" w:noHBand="0" w:noVBand="1" w:firstColumn="1" w:lastRow="0" w:lastColumn="0" w:firstRow="1"/>
       </w:tblPr>
@@ -1876,8 +2000,8 @@
             <w:tcBorders>
               <w:top w:val="single" w:sz="4" w:space="0" w:color="A89662"/>
               <w:left w:val="single" w:sz="4" w:space="0" w:color="A89662"/>
-              <w:bottom w:val="single" w:sz="4" w:space="0" w:color="A89662"/>
-              <w:right w:val="single" w:sz="4" w:space="0" w:color="A89662"/>
+              <w:bottom w:val="single" w:sz="4" w:space="0" w:color="D9D9D2"/>
+              <w:right w:val="single" w:sz="4" w:space="0" w:color="D9D9D2"/>
             </w:tcBorders>
             <w:shd w:color="auto" w:fill="002516" w:val="clear"/>
           </w:tcPr>
@@ -1885,7 +2009,7 @@
             <w:pPr>
               <w:pStyle w:val="Normal"/>
               <w:keepNext w:val="true"/>
-              <w:spacing w:lineRule="auto" w:line="252" w:before="0" w:after="0"/>
+              <w:spacing w:lineRule="auto" w:line="268" w:before="0" w:after="0"/>
               <w:rPr/>
             </w:pPr>
             <w:r>
@@ -1905,8 +2029,8 @@
             <w:tcW w:w="6689" w:type="dxa"/>
             <w:tcBorders>
               <w:top w:val="single" w:sz="4" w:space="0" w:color="A89662"/>
-              <w:left w:val="single" w:sz="4" w:space="0" w:color="A89662"/>
-              <w:bottom w:val="single" w:sz="4" w:space="0" w:color="A89662"/>
+              <w:left w:val="single" w:sz="4" w:space="0" w:color="D9D9D2"/>
+              <w:bottom w:val="single" w:sz="4" w:space="0" w:color="D9D9D2"/>
               <w:right w:val="single" w:sz="4" w:space="0" w:color="A89662"/>
             </w:tcBorders>
             <w:shd w:color="auto" w:fill="002516" w:val="clear"/>
@@ -1915,7 +2039,7 @@
             <w:pPr>
               <w:pStyle w:val="Normal"/>
               <w:keepNext w:val="true"/>
-              <w:spacing w:lineRule="auto" w:line="252" w:before="0" w:after="0"/>
+              <w:spacing w:lineRule="auto" w:line="268" w:before="0" w:after="0"/>
               <w:rPr/>
             </w:pPr>
             <w:r>
@@ -1939,10 +2063,10 @@
           <w:tcPr>
             <w:tcW w:w="2608" w:type="dxa"/>
             <w:tcBorders>
-              <w:top w:val="single" w:sz="4" w:space="0" w:color="A89662"/>
+              <w:top w:val="single" w:sz="4" w:space="0" w:color="D9D9D2"/>
               <w:left w:val="single" w:sz="4" w:space="0" w:color="A89662"/>
-              <w:bottom w:val="single" w:sz="4" w:space="0" w:color="A89662"/>
-              <w:right w:val="single" w:sz="4" w:space="0" w:color="A89662"/>
+              <w:bottom w:val="single" w:sz="4" w:space="0" w:color="D9D9D2"/>
+              <w:right w:val="single" w:sz="4" w:space="0" w:color="D9D9D2"/>
             </w:tcBorders>
             <w:shd w:color="auto" w:fill="CDD2B7" w:val="clear"/>
           </w:tcPr>
@@ -1950,7 +2074,7 @@
             <w:pPr>
               <w:pStyle w:val="Normal"/>
               <w:keepNext w:val="true"/>
-              <w:spacing w:lineRule="auto" w:line="252" w:before="0" w:after="0"/>
+              <w:spacing w:lineRule="auto" w:line="268" w:before="0" w:after="0"/>
               <w:rPr/>
             </w:pPr>
             <w:r>
@@ -1969,9 +2093,9 @@
           <w:tcPr>
             <w:tcW w:w="6689" w:type="dxa"/>
             <w:tcBorders>
-              <w:top w:val="single" w:sz="4" w:space="0" w:color="A89662"/>
-              <w:left w:val="single" w:sz="4" w:space="0" w:color="A89662"/>
-              <w:bottom w:val="single" w:sz="4" w:space="0" w:color="A89662"/>
+              <w:top w:val="single" w:sz="4" w:space="0" w:color="D9D9D2"/>
+              <w:left w:val="single" w:sz="4" w:space="0" w:color="D9D9D2"/>
+              <w:bottom w:val="single" w:sz="4" w:space="0" w:color="D9D9D2"/>
               <w:right w:val="single" w:sz="4" w:space="0" w:color="A89662"/>
             </w:tcBorders>
           </w:tcPr>
@@ -1979,7 +2103,7 @@
             <w:pPr>
               <w:pStyle w:val="Normal"/>
               <w:keepNext w:val="true"/>
-              <w:spacing w:lineRule="auto" w:line="252" w:before="0" w:after="0"/>
+              <w:spacing w:lineRule="auto" w:line="268" w:before="0" w:after="0"/>
               <w:rPr/>
             </w:pPr>
             <w:r>
@@ -1987,7 +2111,7 @@
                 <w:rFonts w:cs="Arial"/>
                 <w:b w:val="false"/>
                 <w:i w:val="false"/>
-                <w:sz w:val="20"/>
+                <w:sz w:val="19"/>
               </w:rPr>
               <w:t>Army Training Review Board (ATRB), subject to confirmation of current governance arrangements.</w:t>
             </w:r>
@@ -2002,10 +2126,10 @@
           <w:tcPr>
             <w:tcW w:w="2608" w:type="dxa"/>
             <w:tcBorders>
-              <w:top w:val="single" w:sz="4" w:space="0" w:color="A89662"/>
+              <w:top w:val="single" w:sz="4" w:space="0" w:color="D9D9D2"/>
               <w:left w:val="single" w:sz="4" w:space="0" w:color="A89662"/>
-              <w:bottom w:val="single" w:sz="4" w:space="0" w:color="A89662"/>
-              <w:right w:val="single" w:sz="4" w:space="0" w:color="A89662"/>
+              <w:bottom w:val="single" w:sz="4" w:space="0" w:color="D9D9D2"/>
+              <w:right w:val="single" w:sz="4" w:space="0" w:color="D9D9D2"/>
             </w:tcBorders>
             <w:shd w:color="auto" w:fill="CDD2B7" w:val="clear"/>
           </w:tcPr>
@@ -2013,7 +2137,7 @@
             <w:pPr>
               <w:pStyle w:val="Normal"/>
               <w:keepNext w:val="true"/>
-              <w:spacing w:lineRule="auto" w:line="252" w:before="0" w:after="0"/>
+              <w:spacing w:lineRule="auto" w:line="268" w:before="0" w:after="0"/>
               <w:rPr/>
             </w:pPr>
             <w:r>
@@ -2032,9 +2156,9 @@
           <w:tcPr>
             <w:tcW w:w="6689" w:type="dxa"/>
             <w:tcBorders>
-              <w:top w:val="single" w:sz="4" w:space="0" w:color="A89662"/>
-              <w:left w:val="single" w:sz="4" w:space="0" w:color="A89662"/>
-              <w:bottom w:val="single" w:sz="4" w:space="0" w:color="A89662"/>
+              <w:top w:val="single" w:sz="4" w:space="0" w:color="D9D9D2"/>
+              <w:left w:val="single" w:sz="4" w:space="0" w:color="D9D9D2"/>
+              <w:bottom w:val="single" w:sz="4" w:space="0" w:color="D9D9D2"/>
               <w:right w:val="single" w:sz="4" w:space="0" w:color="A89662"/>
             </w:tcBorders>
           </w:tcPr>
@@ -2042,7 +2166,7 @@
             <w:pPr>
               <w:pStyle w:val="Normal"/>
               <w:keepNext w:val="true"/>
-              <w:spacing w:lineRule="auto" w:line="252" w:before="0" w:after="0"/>
+              <w:spacing w:lineRule="auto" w:line="268" w:before="0" w:after="0"/>
               <w:rPr/>
             </w:pPr>
             <w:r>
@@ -2050,7 +2174,7 @@
                 <w:rFonts w:cs="Arial"/>
                 <w:b w:val="false"/>
                 <w:i w:val="false"/>
-                <w:sz w:val="20"/>
+                <w:sz w:val="19"/>
               </w:rPr>
               <w:t>Army Command School (ACS)</w:t>
             </w:r>
@@ -2065,17 +2189,17 @@
           <w:tcPr>
             <w:tcW w:w="2608" w:type="dxa"/>
             <w:tcBorders>
-              <w:top w:val="single" w:sz="4" w:space="0" w:color="A89662"/>
+              <w:top w:val="single" w:sz="4" w:space="0" w:color="D9D9D2"/>
               <w:left w:val="single" w:sz="4" w:space="0" w:color="A89662"/>
               <w:bottom w:val="single" w:sz="4" w:space="0" w:color="A89662"/>
-              <w:right w:val="single" w:sz="4" w:space="0" w:color="A89662"/>
+              <w:right w:val="single" w:sz="4" w:space="0" w:color="D9D9D2"/>
             </w:tcBorders>
             <w:shd w:color="auto" w:fill="CDD2B7" w:val="clear"/>
           </w:tcPr>
           <w:p>
             <w:pPr>
               <w:pStyle w:val="Normal"/>
-              <w:spacing w:lineRule="auto" w:line="252" w:before="0" w:after="0"/>
+              <w:spacing w:lineRule="auto" w:line="268" w:before="0" w:after="0"/>
               <w:rPr/>
             </w:pPr>
             <w:r>
@@ -2094,8 +2218,8 @@
           <w:tcPr>
             <w:tcW w:w="6689" w:type="dxa"/>
             <w:tcBorders>
-              <w:top w:val="single" w:sz="4" w:space="0" w:color="A89662"/>
-              <w:left w:val="single" w:sz="4" w:space="0" w:color="A89662"/>
+              <w:top w:val="single" w:sz="4" w:space="0" w:color="D9D9D2"/>
+              <w:left w:val="single" w:sz="4" w:space="0" w:color="D9D9D2"/>
               <w:bottom w:val="single" w:sz="4" w:space="0" w:color="A89662"/>
               <w:right w:val="single" w:sz="4" w:space="0" w:color="A89662"/>
             </w:tcBorders>
@@ -2103,7 +2227,7 @@
           <w:p>
             <w:pPr>
               <w:pStyle w:val="Normal"/>
-              <w:spacing w:lineRule="auto" w:line="252" w:before="0" w:after="0"/>
+              <w:spacing w:lineRule="auto" w:line="268" w:before="0" w:after="0"/>
               <w:rPr/>
             </w:pPr>
             <w:r>
@@ -2111,7 +2235,7 @@
                 <w:rFonts w:cs="Arial"/>
                 <w:b w:val="false"/>
                 <w:i w:val="false"/>
-                <w:sz w:val="20"/>
+                <w:sz w:val="19"/>
               </w:rPr>
               <w:t>New Zealand Army Leadership Centre (NZALC)</w:t>
             </w:r>
@@ -2122,7 +2246,7 @@
     <w:p>
       <w:pPr>
         <w:pStyle w:val="Normal"/>
-        <w:spacing w:before="0" w:after="80"/>
+        <w:spacing w:before="0" w:after="120"/>
         <w:rPr/>
       </w:pPr>
       <w:r>
@@ -2133,7 +2257,7 @@
       <w:pPr>
         <w:pStyle w:val="Normal"/>
         <w:keepNext w:val="true"/>
-        <w:spacing w:before="160" w:after="60"/>
+        <w:spacing w:before="240" w:after="80"/>
         <w:rPr/>
       </w:pPr>
       <w:r>
@@ -2161,7 +2285,7 @@
       <w:r>
         <w:rPr>
           <w:rFonts w:cs="Arial"/>
-          <w:b w:val="false"/>
+          <w:color w:val="000000"/>
         </w:rPr>
         <w:t>1.</w:t>
         <w:tab/>
@@ -2197,7 +2321,7 @@
       <w:r>
         <w:rPr>
           <w:rFonts w:cs="Arial"/>
-          <w:b w:val="false"/>
+          <w:color w:val="000000"/>
         </w:rPr>
         <w:t>2.</w:t>
         <w:tab/>
@@ -2233,7 +2357,7 @@
       <w:r>
         <w:rPr>
           <w:rFonts w:cs="Arial"/>
-          <w:b w:val="false"/>
+          <w:color w:val="000000"/>
         </w:rPr>
         <w:t>3.</w:t>
         <w:tab/>
@@ -2269,7 +2393,7 @@
       <w:r>
         <w:rPr>
           <w:rFonts w:cs="Arial"/>
-          <w:b w:val="false"/>
+          <w:color w:val="000000"/>
         </w:rPr>
         <w:t>4.</w:t>
         <w:tab/>
@@ -2302,7 +2426,7 @@
           <w:b/>
           <w:i w:val="false"/>
           <w:color w:val="002516"/>
-          <w:sz w:val="24"/>
+          <w:sz w:val="25"/>
         </w:rPr>
         <w:t>Nominations and Enrolments</w:t>
       </w:r>
@@ -2311,13 +2435,13 @@
       <w:tblPr>
         <w:tblW w:w="9298" w:type="dxa"/>
         <w:jc w:val="left"/>
-        <w:tblInd w:w="-8" w:type="dxa"/>
+        <w:tblInd w:w="2" w:type="dxa"/>
         <w:tblLayout w:type="fixed"/>
         <w:tblCellMar>
           <w:top w:w="60" w:type="dxa"/>
-          <w:left w:w="100" w:type="dxa"/>
+          <w:left w:w="110" w:type="dxa"/>
           <w:bottom w:w="60" w:type="dxa"/>
-          <w:right w:w="100" w:type="dxa"/>
+          <w:right w:w="110" w:type="dxa"/>
         </w:tblCellMar>
         <w:tblLook w:val="04a0" w:noHBand="0" w:noVBand="1" w:firstColumn="1" w:lastRow="0" w:lastColumn="0" w:firstRow="1"/>
       </w:tblPr>
@@ -2335,8 +2459,8 @@
             <w:tcBorders>
               <w:top w:val="single" w:sz="4" w:space="0" w:color="A89662"/>
               <w:left w:val="single" w:sz="4" w:space="0" w:color="A89662"/>
-              <w:bottom w:val="single" w:sz="4" w:space="0" w:color="A89662"/>
-              <w:right w:val="single" w:sz="4" w:space="0" w:color="A89662"/>
+              <w:bottom w:val="single" w:sz="4" w:space="0" w:color="D9D9D2"/>
+              <w:right w:val="single" w:sz="4" w:space="0" w:color="D9D9D2"/>
             </w:tcBorders>
             <w:shd w:color="auto" w:fill="002516" w:val="clear"/>
           </w:tcPr>
@@ -2344,7 +2468,7 @@
             <w:pPr>
               <w:pStyle w:val="Normal"/>
               <w:keepNext w:val="true"/>
-              <w:spacing w:lineRule="auto" w:line="252" w:before="0" w:after="0"/>
+              <w:spacing w:lineRule="auto" w:line="268" w:before="0" w:after="0"/>
               <w:rPr/>
             </w:pPr>
             <w:r>
@@ -2364,8 +2488,8 @@
             <w:tcW w:w="6689" w:type="dxa"/>
             <w:tcBorders>
               <w:top w:val="single" w:sz="4" w:space="0" w:color="A89662"/>
-              <w:left w:val="single" w:sz="4" w:space="0" w:color="A89662"/>
-              <w:bottom w:val="single" w:sz="4" w:space="0" w:color="A89662"/>
+              <w:left w:val="single" w:sz="4" w:space="0" w:color="D9D9D2"/>
+              <w:bottom w:val="single" w:sz="4" w:space="0" w:color="D9D9D2"/>
               <w:right w:val="single" w:sz="4" w:space="0" w:color="A89662"/>
             </w:tcBorders>
             <w:shd w:color="auto" w:fill="002516" w:val="clear"/>
@@ -2374,7 +2498,7 @@
             <w:pPr>
               <w:pStyle w:val="Normal"/>
               <w:keepNext w:val="true"/>
-              <w:spacing w:lineRule="auto" w:line="252" w:before="0" w:after="0"/>
+              <w:spacing w:lineRule="auto" w:line="268" w:before="0" w:after="0"/>
               <w:rPr/>
             </w:pPr>
             <w:r>
@@ -2398,10 +2522,10 @@
           <w:tcPr>
             <w:tcW w:w="2608" w:type="dxa"/>
             <w:tcBorders>
-              <w:top w:val="single" w:sz="4" w:space="0" w:color="A89662"/>
+              <w:top w:val="single" w:sz="4" w:space="0" w:color="D9D9D2"/>
               <w:left w:val="single" w:sz="4" w:space="0" w:color="A89662"/>
-              <w:bottom w:val="single" w:sz="4" w:space="0" w:color="A89662"/>
-              <w:right w:val="single" w:sz="4" w:space="0" w:color="A89662"/>
+              <w:bottom w:val="single" w:sz="4" w:space="0" w:color="D9D9D2"/>
+              <w:right w:val="single" w:sz="4" w:space="0" w:color="D9D9D2"/>
             </w:tcBorders>
             <w:shd w:color="auto" w:fill="CDD2B7" w:val="clear"/>
           </w:tcPr>
@@ -2409,7 +2533,7 @@
             <w:pPr>
               <w:pStyle w:val="Normal"/>
               <w:keepNext w:val="true"/>
-              <w:spacing w:lineRule="auto" w:line="252" w:before="0" w:after="0"/>
+              <w:spacing w:lineRule="auto" w:line="268" w:before="0" w:after="0"/>
               <w:rPr/>
             </w:pPr>
             <w:r>
@@ -2428,9 +2552,9 @@
           <w:tcPr>
             <w:tcW w:w="6689" w:type="dxa"/>
             <w:tcBorders>
-              <w:top w:val="single" w:sz="4" w:space="0" w:color="A89662"/>
-              <w:left w:val="single" w:sz="4" w:space="0" w:color="A89662"/>
-              <w:bottom w:val="single" w:sz="4" w:space="0" w:color="A89662"/>
+              <w:top w:val="single" w:sz="4" w:space="0" w:color="D9D9D2"/>
+              <w:left w:val="single" w:sz="4" w:space="0" w:color="D9D9D2"/>
+              <w:bottom w:val="single" w:sz="4" w:space="0" w:color="D9D9D2"/>
               <w:right w:val="single" w:sz="4" w:space="0" w:color="A89662"/>
             </w:tcBorders>
           </w:tcPr>
@@ -2438,7 +2562,7 @@
             <w:pPr>
               <w:pStyle w:val="Normal"/>
               <w:keepNext w:val="true"/>
-              <w:spacing w:lineRule="auto" w:line="252" w:before="0" w:after="0"/>
+              <w:spacing w:lineRule="auto" w:line="268" w:before="0" w:after="0"/>
               <w:rPr/>
             </w:pPr>
             <w:r>
@@ -2446,7 +2570,7 @@
                 <w:rFonts w:cs="Arial"/>
                 <w:b w:val="false"/>
                 <w:i w:val="false"/>
-                <w:sz w:val="20"/>
+                <w:sz w:val="19"/>
               </w:rPr>
               <w:t>Chief Instructor, New Zealand Army Leadership Centre</w:t>
             </w:r>
@@ -2461,17 +2585,17 @@
           <w:tcPr>
             <w:tcW w:w="2608" w:type="dxa"/>
             <w:tcBorders>
-              <w:top w:val="single" w:sz="4" w:space="0" w:color="A89662"/>
+              <w:top w:val="single" w:sz="4" w:space="0" w:color="D9D9D2"/>
               <w:left w:val="single" w:sz="4" w:space="0" w:color="A89662"/>
               <w:bottom w:val="single" w:sz="4" w:space="0" w:color="A89662"/>
-              <w:right w:val="single" w:sz="4" w:space="0" w:color="A89662"/>
+              <w:right w:val="single" w:sz="4" w:space="0" w:color="D9D9D2"/>
             </w:tcBorders>
             <w:shd w:color="auto" w:fill="CDD2B7" w:val="clear"/>
           </w:tcPr>
           <w:p>
             <w:pPr>
               <w:pStyle w:val="Normal"/>
-              <w:spacing w:lineRule="auto" w:line="252" w:before="0" w:after="0"/>
+              <w:spacing w:lineRule="auto" w:line="268" w:before="0" w:after="0"/>
               <w:rPr/>
             </w:pPr>
             <w:r>
@@ -2490,8 +2614,8 @@
           <w:tcPr>
             <w:tcW w:w="6689" w:type="dxa"/>
             <w:tcBorders>
-              <w:top w:val="single" w:sz="4" w:space="0" w:color="A89662"/>
-              <w:left w:val="single" w:sz="4" w:space="0" w:color="A89662"/>
+              <w:top w:val="single" w:sz="4" w:space="0" w:color="D9D9D2"/>
+              <w:left w:val="single" w:sz="4" w:space="0" w:color="D9D9D2"/>
               <w:bottom w:val="single" w:sz="4" w:space="0" w:color="A89662"/>
               <w:right w:val="single" w:sz="4" w:space="0" w:color="A89662"/>
             </w:tcBorders>
@@ -2499,7 +2623,7 @@
           <w:p>
             <w:pPr>
               <w:pStyle w:val="Normal"/>
-              <w:spacing w:lineRule="auto" w:line="252" w:before="0" w:after="0"/>
+              <w:spacing w:lineRule="auto" w:line="268" w:before="0" w:after="0"/>
               <w:rPr/>
             </w:pPr>
             <w:r>
@@ -2507,7 +2631,7 @@
                 <w:rFonts w:cs="Arial"/>
                 <w:b w:val="false"/>
                 <w:i w:val="false"/>
-                <w:sz w:val="20"/>
+                <w:sz w:val="19"/>
               </w:rPr>
               <w:t>Open: D-90</w:t>
             </w:r>
@@ -2520,7 +2644,7 @@
                 <w:rFonts w:cs="Arial"/>
                 <w:b w:val="false"/>
                 <w:i w:val="false"/>
-                <w:sz w:val="20"/>
+                <w:sz w:val="19"/>
               </w:rPr>
               <w:t>Close: D-15</w:t>
             </w:r>
@@ -2531,7 +2655,7 @@
     <w:p>
       <w:pPr>
         <w:pStyle w:val="Normal"/>
-        <w:spacing w:before="0" w:after="80"/>
+        <w:spacing w:before="0" w:after="120"/>
         <w:rPr/>
       </w:pPr>
       <w:r>
@@ -2542,7 +2666,7 @@
       <w:pPr>
         <w:pStyle w:val="Normal"/>
         <w:keepNext w:val="true"/>
-        <w:spacing w:before="160" w:after="60"/>
+        <w:spacing w:before="240" w:after="80"/>
         <w:rPr/>
       </w:pPr>
       <w:r>
@@ -2574,7 +2698,7 @@
       <w:pPr>
         <w:pStyle w:val="Normal"/>
         <w:keepNext w:val="true"/>
-        <w:spacing w:before="160" w:after="60"/>
+        <w:spacing w:before="240" w:after="80"/>
         <w:rPr/>
       </w:pPr>
       <w:r>
@@ -2606,7 +2730,7 @@
       <w:pPr>
         <w:pStyle w:val="Normal"/>
         <w:keepNext w:val="true"/>
-        <w:spacing w:before="160" w:after="60"/>
+        <w:spacing w:before="240" w:after="80"/>
         <w:rPr/>
       </w:pPr>
       <w:r>
@@ -2638,7 +2762,7 @@
       <w:pPr>
         <w:pStyle w:val="Normal"/>
         <w:keepNext w:val="true"/>
-        <w:spacing w:before="160" w:after="60"/>
+        <w:spacing w:before="240" w:after="80"/>
         <w:rPr/>
       </w:pPr>
       <w:r>
@@ -2659,14 +2783,15 @@
           <w:tab w:val="clear" w:pos="720"/>
           <w:tab w:val="left" w:pos="397" w:leader="none"/>
         </w:tabs>
-        <w:spacing w:before="60" w:after="40"/>
+        <w:spacing w:lineRule="auto" w:line="252" w:before="20" w:after="40"/>
         <w:ind w:hanging="397" w:left="397"/>
         <w:rPr/>
       </w:pPr>
       <w:r>
         <w:rPr>
           <w:rFonts w:cs="Arial"/>
-          <w:b w:val="false"/>
+          <w:color w:val="002516"/>
+          <w:sz w:val="19"/>
         </w:rPr>
         <w:t>1.</w:t>
         <w:tab/>
@@ -2676,6 +2801,7 @@
           <w:rFonts w:cs="Arial"/>
           <w:b w:val="false"/>
           <w:i w:val="false"/>
+          <w:sz w:val="19"/>
         </w:rPr>
         <w:t>ELDA Command develops command effectiveness through experiential learning conducted in complex and demanding environments involving real consequences, uncertainty, interpersonal dynamics and managed risk.</w:t>
       </w:r>
@@ -2687,14 +2813,15 @@
           <w:tab w:val="clear" w:pos="720"/>
           <w:tab w:val="left" w:pos="397" w:leader="none"/>
         </w:tabs>
-        <w:spacing w:before="60" w:after="40"/>
+        <w:spacing w:lineRule="auto" w:line="252" w:before="20" w:after="40"/>
         <w:ind w:hanging="397" w:left="397"/>
         <w:rPr/>
       </w:pPr>
       <w:r>
         <w:rPr>
           <w:rFonts w:cs="Arial"/>
-          <w:b w:val="false"/>
+          <w:color w:val="002516"/>
+          <w:sz w:val="19"/>
         </w:rPr>
         <w:t>2.</w:t>
         <w:tab/>
@@ -2704,6 +2831,7 @@
           <w:rFonts w:cs="Arial"/>
           <w:b w:val="false"/>
           <w:i w:val="false"/>
+          <w:sz w:val="19"/>
         </w:rPr>
         <w:t>The selected adventure activity provides the experiential vehicle for command and leadership development; successful completion of the activity is not, in itself, the primary learning outcome.</w:t>
       </w:r>
@@ -2715,14 +2843,15 @@
           <w:tab w:val="clear" w:pos="720"/>
           <w:tab w:val="left" w:pos="397" w:leader="none"/>
         </w:tabs>
-        <w:spacing w:before="60" w:after="40"/>
+        <w:spacing w:lineRule="auto" w:line="252" w:before="20" w:after="40"/>
         <w:ind w:hanging="397" w:left="397"/>
         <w:rPr/>
       </w:pPr>
       <w:r>
         <w:rPr>
           <w:rFonts w:cs="Arial"/>
-          <w:b w:val="false"/>
+          <w:color w:val="002516"/>
+          <w:sz w:val="19"/>
         </w:rPr>
         <w:t>3.</w:t>
         <w:tab/>
@@ -2732,6 +2861,7 @@
           <w:rFonts w:cs="Arial"/>
           <w:b w:val="false"/>
           <w:i w:val="false"/>
+          <w:sz w:val="19"/>
         </w:rPr>
         <w:t>The course develops strategic self-awareness by enabling learners to identify and evaluate their default behaviours, assumptions, biases and decision-making tendencies, and the effects these have on people, teams and organisational outcomes.</w:t>
       </w:r>
@@ -2743,14 +2873,15 @@
           <w:tab w:val="clear" w:pos="720"/>
           <w:tab w:val="left" w:pos="397" w:leader="none"/>
         </w:tabs>
-        <w:spacing w:before="60" w:after="40"/>
+        <w:spacing w:lineRule="auto" w:line="252" w:before="20" w:after="40"/>
         <w:ind w:hanging="397" w:left="397"/>
         <w:rPr/>
       </w:pPr>
       <w:r>
         <w:rPr>
           <w:rFonts w:cs="Arial"/>
-          <w:b w:val="false"/>
+          <w:color w:val="002516"/>
+          <w:sz w:val="19"/>
         </w:rPr>
         <w:t>4.</w:t>
         <w:tab/>
@@ -2760,6 +2891,7 @@
           <w:rFonts w:cs="Arial"/>
           <w:b w:val="false"/>
           <w:i w:val="false"/>
+          <w:sz w:val="19"/>
         </w:rPr>
         <w:t>Psychometric, leadership and team-development tools may be used to support self-awareness, reflection and team development. These tools support the learning outcomes rather than constitute learning outcomes in themselves.</w:t>
       </w:r>
@@ -2771,14 +2903,15 @@
           <w:tab w:val="clear" w:pos="720"/>
           <w:tab w:val="left" w:pos="397" w:leader="none"/>
         </w:tabs>
-        <w:spacing w:before="60" w:after="40"/>
+        <w:spacing w:lineRule="auto" w:line="252" w:before="20" w:after="40"/>
         <w:ind w:hanging="397" w:left="397"/>
         <w:rPr/>
       </w:pPr>
       <w:r>
         <w:rPr>
           <w:rFonts w:cs="Arial"/>
-          <w:b w:val="false"/>
+          <w:color w:val="002516"/>
+          <w:sz w:val="19"/>
         </w:rPr>
         <w:t>5.</w:t>
         <w:tab/>
@@ -2788,6 +2921,7 @@
           <w:rFonts w:cs="Arial"/>
           <w:b w:val="false"/>
           <w:i w:val="false"/>
+          <w:sz w:val="19"/>
         </w:rPr>
         <w:t>Learners are provided repeated opportunities to exercise judgement, make decisions, observe their effects, receive feedback, reflect, adapt their behaviour and reapply their learning.</w:t>
       </w:r>
@@ -2799,14 +2933,15 @@
           <w:tab w:val="clear" w:pos="720"/>
           <w:tab w:val="left" w:pos="397" w:leader="none"/>
         </w:tabs>
-        <w:spacing w:before="60" w:after="40"/>
+        <w:spacing w:lineRule="auto" w:line="252" w:before="20" w:after="40"/>
         <w:ind w:hanging="397" w:left="397"/>
         <w:rPr/>
       </w:pPr>
       <w:r>
         <w:rPr>
           <w:rFonts w:cs="Arial"/>
-          <w:b w:val="false"/>
+          <w:color w:val="002516"/>
+          <w:sz w:val="19"/>
         </w:rPr>
         <w:t>6.</w:t>
         <w:tab/>
@@ -2816,6 +2951,7 @@
           <w:rFonts w:cs="Arial"/>
           <w:b w:val="false"/>
           <w:i w:val="false"/>
+          <w:sz w:val="19"/>
         </w:rPr>
         <w:t>Army ethos and values are embedded throughout the course and are demonstrated through observable judgement, decision-making, use of authority, treatment of others and leadership behaviour.</w:t>
       </w:r>
@@ -2827,14 +2963,15 @@
           <w:tab w:val="clear" w:pos="720"/>
           <w:tab w:val="left" w:pos="397" w:leader="none"/>
         </w:tabs>
-        <w:spacing w:before="60" w:after="40"/>
+        <w:spacing w:lineRule="auto" w:line="252" w:before="20" w:after="40"/>
         <w:ind w:hanging="397" w:left="397"/>
         <w:rPr/>
       </w:pPr>
       <w:r>
         <w:rPr>
           <w:rFonts w:cs="Arial"/>
-          <w:b w:val="false"/>
+          <w:color w:val="002516"/>
+          <w:sz w:val="19"/>
         </w:rPr>
         <w:t>7.</w:t>
         <w:tab/>
@@ -2844,6 +2981,7 @@
           <w:rFonts w:cs="Arial"/>
           <w:b w:val="false"/>
           <w:i w:val="false"/>
+          <w:sz w:val="19"/>
         </w:rPr>
         <w:t>Course activities are designed to enable learners to examine how their leadership creates or inhibits the conditions required for trust, clarity, appropriate challenge, accountability, initiative and effective team performance.</w:t>
       </w:r>
@@ -2855,14 +2993,15 @@
           <w:tab w:val="clear" w:pos="720"/>
           <w:tab w:val="left" w:pos="397" w:leader="none"/>
         </w:tabs>
-        <w:spacing w:before="60" w:after="40"/>
+        <w:spacing w:lineRule="auto" w:line="252" w:before="20" w:after="40"/>
         <w:ind w:hanging="397" w:left="397"/>
         <w:rPr/>
       </w:pPr>
       <w:r>
         <w:rPr>
           <w:rFonts w:cs="Arial"/>
-          <w:b w:val="false"/>
+          <w:color w:val="002516"/>
+          <w:sz w:val="19"/>
         </w:rPr>
         <w:t>8.</w:t>
         <w:tab/>
@@ -2872,6 +3011,7 @@
           <w:rFonts w:cs="Arial"/>
           <w:b w:val="false"/>
           <w:i w:val="false"/>
+          <w:sz w:val="19"/>
         </w:rPr>
         <w:t>Learning identified during ELDA Command is to inform the learner's ongoing Leadership Development Plan and continued development within command and senior leadership appointments.</w:t>
       </w:r>
@@ -2883,14 +3023,15 @@
           <w:tab w:val="clear" w:pos="720"/>
           <w:tab w:val="left" w:pos="397" w:leader="none"/>
         </w:tabs>
-        <w:spacing w:before="60" w:after="40"/>
+        <w:spacing w:lineRule="auto" w:line="252" w:before="20" w:after="40"/>
         <w:ind w:hanging="397" w:left="397"/>
         <w:rPr/>
       </w:pPr>
       <w:r>
         <w:rPr>
           <w:rFonts w:cs="Arial"/>
-          <w:b w:val="false"/>
+          <w:color w:val="002516"/>
+          <w:sz w:val="19"/>
         </w:rPr>
         <w:t>9.</w:t>
         <w:tab/>
@@ -2900,6 +3041,7 @@
           <w:rFonts w:cs="Arial"/>
           <w:b w:val="false"/>
           <w:i w:val="false"/>
+          <w:sz w:val="19"/>
         </w:rPr>
         <w:t>Course duration may vary between 8 and 10 training days depending on activity, travel requirements, learner experience and course design.</w:t>
       </w:r>
@@ -2911,14 +3053,15 @@
           <w:tab w:val="clear" w:pos="720"/>
           <w:tab w:val="left" w:pos="397" w:leader="none"/>
         </w:tabs>
-        <w:spacing w:before="60" w:after="40"/>
+        <w:spacing w:lineRule="auto" w:line="252" w:before="20" w:after="40"/>
         <w:ind w:hanging="397" w:left="397"/>
         <w:rPr/>
       </w:pPr>
       <w:r>
         <w:rPr>
           <w:rFonts w:cs="Arial"/>
-          <w:b w:val="false"/>
+          <w:color w:val="002516"/>
+          <w:sz w:val="19"/>
         </w:rPr>
         <w:t>10.</w:t>
         <w:tab/>
@@ -2928,6 +3071,7 @@
           <w:rFonts w:cs="Arial"/>
           <w:b w:val="false"/>
           <w:i w:val="false"/>
+          <w:sz w:val="19"/>
         </w:rPr>
         <w:t>Activity selection, instructor allocation and delivery are to comply with the NZALC Safety Management Plan and applicable activity SOPs.</w:t>
       </w:r>
@@ -2939,14 +3083,15 @@
           <w:tab w:val="clear" w:pos="720"/>
           <w:tab w:val="left" w:pos="397" w:leader="none"/>
         </w:tabs>
-        <w:spacing w:before="60" w:after="40"/>
+        <w:spacing w:lineRule="auto" w:line="252" w:before="20" w:after="40"/>
         <w:ind w:hanging="397" w:left="397"/>
         <w:rPr/>
       </w:pPr>
       <w:r>
         <w:rPr>
           <w:rFonts w:cs="Arial"/>
-          <w:b w:val="false"/>
+          <w:color w:val="002516"/>
+          <w:sz w:val="19"/>
         </w:rPr>
         <w:t>11.</w:t>
         <w:tab/>
@@ -2956,6 +3101,7 @@
           <w:rFonts w:cs="Arial"/>
           <w:b w:val="false"/>
           <w:i w:val="false"/>
+          <w:sz w:val="19"/>
         </w:rPr>
         <w:t>The Learning Provider is the New Zealand Army Leadership Centre (NZALC).</w:t>
       </w:r>
@@ -2964,7 +3110,7 @@
       <w:pPr>
         <w:pStyle w:val="Normal"/>
         <w:keepNext w:val="true"/>
-        <w:spacing w:before="160" w:after="60"/>
+        <w:spacing w:before="240" w:after="80"/>
         <w:rPr/>
       </w:pPr>
       <w:r>
@@ -3003,7 +3149,7 @@
           <w:b/>
           <w:i w:val="false"/>
           <w:color w:val="002516"/>
-          <w:sz w:val="24"/>
+          <w:sz w:val="25"/>
         </w:rPr>
         <w:t>Course Structure</w:t>
       </w:r>
@@ -3012,7 +3158,7 @@
       <w:pPr>
         <w:pStyle w:val="Normal"/>
         <w:keepNext w:val="true"/>
-        <w:spacing w:before="160" w:after="60"/>
+        <w:spacing w:before="240" w:after="80"/>
         <w:rPr/>
       </w:pPr>
       <w:r>
@@ -3030,7 +3176,12 @@
       <w:pPr>
         <w:pStyle w:val="Normal"/>
         <w:keepNext w:val="true"/>
-        <w:spacing w:before="120" w:after="60"/>
+        <w:pBdr>
+          <w:left w:val="single" w:sz="14" w:space="10" w:color="002516"/>
+        </w:pBdr>
+        <w:shd w:val="clear" w:color="auto" w:fill="EEF1E5"/>
+        <w:spacing w:before="200" w:after="120"/>
+        <w:ind w:left="312" w:right="170"/>
         <w:rPr/>
       </w:pPr>
       <w:r>
@@ -3038,15 +3189,32 @@
           <w:rFonts w:cs="Arial"/>
           <w:b/>
           <w:i w:val="false"/>
+          <w:color w:val="002516"/>
+          <w:spacing w:val="20"/>
+          <w:sz w:val="17"/>
+        </w:rPr>
+        <w:t>LO 1.1</w:t>
+      </w:r>
+      <w:r>
+        <w:rPr/>
+        <w:br/>
+      </w:r>
+      <w:r>
+        <w:rPr>
+          <w:rFonts w:cs="Arial"/>
+          <w:b/>
+          <w:i w:val="false"/>
           <w:color w:val="000000"/>
-          <w:sz w:val="20"/>
-        </w:rPr>
-        <w:t>LO 1.1: Evaluate personal command behaviour, judgement and bias</w:t>
-      </w:r>
-    </w:p>
-    <w:p>
-      <w:pPr>
-        <w:pStyle w:val="Normal"/>
+          <w:sz w:val="22"/>
+        </w:rPr>
+        <w:t>Evaluate personal command behaviour, judgement and bias</w:t>
+      </w:r>
+    </w:p>
+    <w:p>
+      <w:pPr>
+        <w:pStyle w:val="Normal"/>
+        <w:spacing w:before="0" w:after="80"/>
+        <w:ind w:left="312"/>
         <w:rPr/>
       </w:pPr>
       <w:r>
@@ -3062,7 +3230,12 @@
       <w:pPr>
         <w:pStyle w:val="Normal"/>
         <w:keepNext w:val="true"/>
-        <w:spacing w:before="120" w:after="60"/>
+        <w:pBdr>
+          <w:left w:val="single" w:sz="14" w:space="10" w:color="002516"/>
+        </w:pBdr>
+        <w:shd w:val="clear" w:color="auto" w:fill="EEF1E5"/>
+        <w:spacing w:before="200" w:after="120"/>
+        <w:ind w:left="312" w:right="170"/>
         <w:rPr/>
       </w:pPr>
       <w:r>
@@ -3070,15 +3243,32 @@
           <w:rFonts w:cs="Arial"/>
           <w:b/>
           <w:i w:val="false"/>
+          <w:color w:val="002516"/>
+          <w:spacing w:val="20"/>
+          <w:sz w:val="17"/>
+        </w:rPr>
+        <w:t>LO 1.2</w:t>
+      </w:r>
+      <w:r>
+        <w:rPr/>
+        <w:br/>
+      </w:r>
+      <w:r>
+        <w:rPr>
+          <w:rFonts w:cs="Arial"/>
+          <w:b/>
+          <w:i w:val="false"/>
           <w:color w:val="000000"/>
-          <w:sz w:val="20"/>
-        </w:rPr>
-        <w:t>LO 1.2: Exercise judgement and make decisions in complex and demanding conditions</w:t>
-      </w:r>
-    </w:p>
-    <w:p>
-      <w:pPr>
-        <w:pStyle w:val="Normal"/>
+          <w:sz w:val="22"/>
+        </w:rPr>
+        <w:t>Exercise judgement and make decisions in complex and demanding conditions</w:t>
+      </w:r>
+    </w:p>
+    <w:p>
+      <w:pPr>
+        <w:pStyle w:val="Normal"/>
+        <w:spacing w:before="0" w:after="80"/>
+        <w:ind w:left="312"/>
         <w:rPr/>
       </w:pPr>
       <w:r>
@@ -3094,7 +3284,12 @@
       <w:pPr>
         <w:pStyle w:val="Normal"/>
         <w:keepNext w:val="true"/>
-        <w:spacing w:before="120" w:after="60"/>
+        <w:pBdr>
+          <w:left w:val="single" w:sz="14" w:space="10" w:color="002516"/>
+        </w:pBdr>
+        <w:shd w:val="clear" w:color="auto" w:fill="EEF1E5"/>
+        <w:spacing w:before="200" w:after="120"/>
+        <w:ind w:left="312" w:right="170"/>
         <w:rPr/>
       </w:pPr>
       <w:r>
@@ -3102,15 +3297,32 @@
           <w:rFonts w:cs="Arial"/>
           <w:b/>
           <w:i w:val="false"/>
+          <w:color w:val="002516"/>
+          <w:spacing w:val="20"/>
+          <w:sz w:val="17"/>
+        </w:rPr>
+        <w:t>LO 1.3</w:t>
+      </w:r>
+      <w:r>
+        <w:rPr/>
+        <w:br/>
+      </w:r>
+      <w:r>
+        <w:rPr>
+          <w:rFonts w:cs="Arial"/>
+          <w:b/>
+          <w:i w:val="false"/>
           <w:color w:val="000000"/>
-          <w:sz w:val="20"/>
-        </w:rPr>
-        <w:t>LO 1.3: Create the conditions for effective team and organisational performance</w:t>
-      </w:r>
-    </w:p>
-    <w:p>
-      <w:pPr>
-        <w:pStyle w:val="Normal"/>
+          <w:sz w:val="22"/>
+        </w:rPr>
+        <w:t>Create the conditions for effective team and organisational performance</w:t>
+      </w:r>
+    </w:p>
+    <w:p>
+      <w:pPr>
+        <w:pStyle w:val="Normal"/>
+        <w:spacing w:before="0" w:after="80"/>
+        <w:ind w:left="312"/>
         <w:rPr/>
       </w:pPr>
       <w:r>
@@ -3126,7 +3338,12 @@
       <w:pPr>
         <w:pStyle w:val="Normal"/>
         <w:keepNext w:val="true"/>
-        <w:spacing w:before="120" w:after="60"/>
+        <w:pBdr>
+          <w:left w:val="single" w:sz="14" w:space="10" w:color="002516"/>
+        </w:pBdr>
+        <w:shd w:val="clear" w:color="auto" w:fill="EEF1E5"/>
+        <w:spacing w:before="200" w:after="120"/>
+        <w:ind w:left="312" w:right="170"/>
         <w:rPr/>
       </w:pPr>
       <w:r>
@@ -3134,19 +3351,32 @@
           <w:rFonts w:cs="Arial"/>
           <w:b/>
           <w:i w:val="false"/>
+          <w:color w:val="002516"/>
+          <w:spacing w:val="20"/>
+          <w:sz w:val="17"/>
+        </w:rPr>
+        <w:t>LO 1.4</w:t>
+      </w:r>
+      <w:r>
+        <w:rPr/>
+        <w:br/>
+      </w:r>
+      <w:r>
+        <w:rPr>
+          <w:rFonts w:cs="Arial"/>
+          <w:b/>
+          <w:i w:val="false"/>
           <w:color w:val="000000"/>
-          <w:sz w:val="20"/>
-        </w:rPr>
-        <w:t>LO 1.4: Establish strategies for sustained command effectiveness across changing contexts</w:t>
-      </w:r>
-    </w:p>
-    <w:p>
-      <w:pPr>
-        <w:pStyle w:val="Normal"/>
-        <w:widowControl/>
-        <w:bidi w:val="0"/>
-        <w:spacing w:lineRule="auto" w:line="268" w:before="0" w:after="100"/>
-        <w:jc w:val="left"/>
+          <w:sz w:val="22"/>
+        </w:rPr>
+        <w:t>Establish strategies for sustained command effectiveness across changing contexts</w:t>
+      </w:r>
+    </w:p>
+    <w:p>
+      <w:pPr>
+        <w:pStyle w:val="Normal"/>
+        <w:spacing w:before="0" w:after="80"/>
+        <w:ind w:left="312"/>
         <w:rPr/>
       </w:pPr>
       <w:r>
@@ -3227,7 +3457,7 @@
         <w:color w:val="000000"/>
         <w:sz w:val="17"/>
       </w:rPr>
-      <w:t>A18009 ELDA Command Course Data Sheet</w:t>
+      <w:t>NZALC | ELDA Command Course Data Sheet</w:t>
       <w:tab/>
       <w:t>ACS 2026</w:t>
       <w:tab/>
@@ -3351,7 +3581,7 @@
         <w:color w:val="000000"/>
         <w:sz w:val="17"/>
       </w:rPr>
-      <w:t>A18009 ELDA Command Course Data Sheet</w:t>
+      <w:t>NZALC | ELDA Command Course Data Sheet</w:t>
       <w:tab/>
       <w:t>ACS 2026</w:t>
       <w:tab/>
@@ -3682,7 +3912,7 @@
     <w:pPr>
       <w:keepNext w:val="true"/>
       <w:keepLines/>
-      <w:spacing w:before="240" w:after="100"/>
+      <w:spacing w:before="360" w:after="160"/>
       <w:outlineLvl w:val="0"/>
     </w:pPr>
     <w:rPr>
@@ -3703,7 +3933,7 @@
     <w:pPr>
       <w:keepNext w:val="true"/>
       <w:keepLines/>
-      <w:spacing w:before="240" w:after="100"/>
+      <w:spacing w:before="360" w:after="160"/>
       <w:outlineLvl w:val="1"/>
     </w:pPr>
     <w:rPr>

</xml_diff>

<commit_message>
Re-centre ELDA Command on the command team and simplify the pathway
Rewrite the Command data sheet around the collective effectiveness of
command teams (aim, learners, competency, next step, notes, COG and all
four learning outcomes), align the feeder sheets' next steps, and rebuild
the pathway page as one left-to-right progression (self, others, system,
collective) with the revised key message.

Co-Authored-By: Claude Fable 5.1 <noreply@anthropic.com>
Claude-Session: https://claude.ai/code/session_01LgFPs3fMSncBgbYQ3PfA3o
</commit_message>
<xml_diff>
--- a/output/elda-command-data-sheet.docx
+++ b/output/elda-command-data-sheet.docx
@@ -815,7 +815,7 @@
                 <w:i w:val="false"/>
                 <w:sz w:val="19"/>
               </w:rPr>
-              <w:t>The aim of ELDA Command is to develop command effectiveness by enhancing self-awareness, judgement and deliberate leadership behaviour, enabling learners to create the conditions for effective team and organisational performance in complex and demanding environments.</w:t>
+              <w:t>The aim of ELDA Command is to develop the collective effectiveness of command teams by strengthening shared understanding, cohesion, judgement and leadership alignment, enabling them to create the conditions for effective organisational performance in complex and demanding environments.</w:t>
             </w:r>
           </w:p>
         </w:tc>
@@ -1015,7 +1015,7 @@
                 <w:i w:val="false"/>
                 <w:sz w:val="19"/>
               </w:rPr>
-              <w:t>1. Personnel selected for, preparing for, or currently undertaking significant command or senior leadership appointments.</w:t>
+              <w:t>1. Established or forming command teams and leadership groups, including unit headquarters, command teams, principal staff officers and subordinate command teams, where collective leadership effectiveness is critical to organisational performance.</w:t>
             </w:r>
             <w:r>
               <w:rPr/>
@@ -1028,7 +1028,7 @@
                 <w:i w:val="false"/>
                 <w:sz w:val="19"/>
               </w:rPr>
-              <w:t>2. Other personnel identified as requiring command-level experiential leadership development, as determined by the Learning Provider and relevant career management authority.</w:t>
+              <w:t>2. Other appropriately constituted senior leadership groups, as determined by the Learning Provider in consultation with the relevant command and career management authorities.</w:t>
             </w:r>
           </w:p>
         </w:tc>
@@ -1089,7 +1089,7 @@
                 <w:i w:val="false"/>
                 <w:sz w:val="19"/>
               </w:rPr>
-              <w:t>Learners will be able to evaluate how their judgement and leadership behaviour affect people, teams and organisational outcomes, and deliberately shape the conditions required for effective performance in complex and demanding contexts.</w:t>
+              <w:t>Learners will be able to contribute effectively to a cohesive command team, applying self-awareness, shared understanding and sound judgement to align leadership effort, strengthen command relationships and create the conditions for effective organisational performance.</w:t>
             </w:r>
           </w:p>
         </w:tc>
@@ -1150,7 +1150,7 @@
                 <w:i w:val="false"/>
                 <w:sz w:val="19"/>
               </w:rPr>
-              <w:t>1. Apply the insights and strategies developed through ELDA Command within current and future command and senior leadership appointments.</w:t>
+              <w:t>1. Apply the shared understanding, working practices and leadership alignment developed on ELDA Command within the command team's current appointments and operating rhythm.</w:t>
             </w:r>
             <w:r>
               <w:rPr/>
@@ -1163,7 +1163,7 @@
                 <w:i w:val="false"/>
                 <w:sz w:val="19"/>
               </w:rPr>
-              <w:t>2. Continue deliberate reflection, feedback and adaptation of command behaviour as context, responsibility and organisational complexity change.</w:t>
+              <w:t>2. Continue deliberate collective reflection, feedback and adaptation of command behaviour as the team's context, composition and responsibilities change.</w:t>
             </w:r>
             <w:r>
               <w:rPr/>
@@ -1176,7 +1176,7 @@
                 <w:i w:val="false"/>
                 <w:sz w:val="19"/>
               </w:rPr>
-              <w:t>3. Review and update the individual Leadership Development Plan (LDP) to reflect emerging command and leadership development priorities.</w:t>
+              <w:t>3. Review and update individual Leadership Development Plans (LDPs) to reflect the command and leadership development priorities identified through the course.</w:t>
             </w:r>
           </w:p>
         </w:tc>
@@ -2412,7 +2412,7 @@
           <w:b w:val="false"/>
           <w:i w:val="false"/>
         </w:rPr>
-        <w:t xml:space="preserve"> Instructors responsible for developmental facilitation are to possess the experience and capability appropriate to facilitating command-level leadership development.</w:t>
+        <w:t xml:space="preserve"> Instructors responsible for developmental facilitation are to possess the experience and capability appropriate to facilitating command-team development at unit level and above.</w:t>
       </w:r>
     </w:p>
     <w:p>
@@ -2697,6 +2697,20 @@
     <w:p>
       <w:pPr>
         <w:pStyle w:val="Normal"/>
+        <w:rPr/>
+      </w:pPr>
+      <w:r>
+        <w:rPr>
+          <w:rFonts w:cs="Arial"/>
+          <w:b w:val="false"/>
+          <w:i w:val="false"/>
+        </w:rPr>
+        <w:t>Nominations are normally made for a command team as a whole, by or on behalf of its commander.</w:t>
+      </w:r>
+    </w:p>
+    <w:p>
+      <w:pPr>
+        <w:pStyle w:val="Normal"/>
         <w:keepNext w:val="true"/>
         <w:spacing w:before="240" w:after="80"/>
         <w:rPr/>
@@ -2723,7 +2737,7 @@
           <w:b w:val="false"/>
           <w:i w:val="false"/>
         </w:rPr>
-        <w:t>Priority is given to personnel preparing for, or recently appointed to, significant command and senior leadership appointments, as determined by the Learning Provider in consultation with relevant career management authorities.</w:t>
+        <w:t>Priority is given to command teams preparing for, or recently assuming, significant command appointments, and to command teams entering demanding operational or organisational periods, as determined by the Learning Provider in consultation with the relevant command and career management authorities.</w:t>
       </w:r>
     </w:p>
     <w:p>
@@ -2803,7 +2817,7 @@
           <w:i w:val="false"/>
           <w:sz w:val="19"/>
         </w:rPr>
-        <w:t>ELDA Command develops command effectiveness through experiential learning conducted in complex and demanding environments involving real consequences, uncertainty, interpersonal dynamics and managed risk.</w:t>
+        <w:t>ELDA Command develops the collective effectiveness of command teams through experiential learning conducted in complex and demanding environments involving real consequences, uncertainty, interpersonal dynamics and managed risk.</w:t>
       </w:r>
     </w:p>
     <w:p>
@@ -2833,7 +2847,7 @@
           <w:i w:val="false"/>
           <w:sz w:val="19"/>
         </w:rPr>
-        <w:t>The selected adventure activity provides the experiential vehicle for command and leadership development; successful completion of the activity is not, in itself, the primary learning outcome.</w:t>
+        <w:t>The course is normally delivered to an existing or forming command or leadership collective, for example a unit headquarters, or a unit command team together with its subordinate command teams, rather than to individuals drawn from different organisations.</w:t>
       </w:r>
     </w:p>
     <w:p>
@@ -2863,7 +2877,7 @@
           <w:i w:val="false"/>
           <w:sz w:val="19"/>
         </w:rPr>
-        <w:t>The course develops strategic self-awareness by enabling learners to identify and evaluate their default behaviours, assumptions, biases and decision-making tendencies, and the effects these have on people, teams and organisational outcomes.</w:t>
+        <w:t>The selected adventure activity provides the experiential vehicle for command-team development; successful completion of the activity is not, in itself, the primary learning outcome.</w:t>
       </w:r>
     </w:p>
     <w:p>
@@ -2893,7 +2907,7 @@
           <w:i w:val="false"/>
           <w:sz w:val="19"/>
         </w:rPr>
-        <w:t>Psychometric, leadership and team-development tools may be used to support self-awareness, reflection and team development. These tools support the learning outcomes rather than constitute learning outcomes in themselves.</w:t>
+        <w:t>The course develops shared understanding by enabling team members to identify and evaluate their individual and collective leadership preferences, default behaviours, assumptions and biases, and the effects these have on command relationships, decisions and organisational outcomes.</w:t>
       </w:r>
     </w:p>
     <w:p>
@@ -2923,7 +2937,7 @@
           <w:i w:val="false"/>
           <w:sz w:val="19"/>
         </w:rPr>
-        <w:t>Learners are provided repeated opportunities to exercise judgement, make decisions, observe their effects, receive feedback, reflect, adapt their behaviour and reapply their learning.</w:t>
+        <w:t>Psychometric, leadership and team-development tools may be used to support self-awareness, shared understanding and team development. These tools support the learning outcomes rather than constitute learning outcomes in themselves.</w:t>
       </w:r>
     </w:p>
     <w:p>
@@ -2953,7 +2967,7 @@
           <w:i w:val="false"/>
           <w:sz w:val="19"/>
         </w:rPr>
-        <w:t>Army ethos and values are embedded throughout the course and are demonstrated through observable judgement, decision-making, use of authority, treatment of others and leadership behaviour.</w:t>
+        <w:t>The command team is provided repeated opportunities to exercise individual and collective judgement, make decisions, observe their effects, receive feedback, reflect, adapt and reapply their learning together.</w:t>
       </w:r>
     </w:p>
     <w:p>
@@ -2983,7 +2997,7 @@
           <w:i w:val="false"/>
           <w:sz w:val="19"/>
         </w:rPr>
-        <w:t>Course activities are designed to enable learners to examine how their leadership creates or inhibits the conditions required for trust, clarity, appropriate challenge, accountability, initiative and effective team performance.</w:t>
+        <w:t>Army ethos and values are embedded throughout the course and are demonstrated through observable judgement, decision-making, use of authority, treatment of others and leadership behaviour within the command team.</w:t>
       </w:r>
     </w:p>
     <w:p>
@@ -3013,7 +3027,7 @@
           <w:i w:val="false"/>
           <w:sz w:val="19"/>
         </w:rPr>
-        <w:t>Learning identified during ELDA Command is to inform the learner's ongoing Leadership Development Plan and continued development within command and senior leadership appointments.</w:t>
+        <w:t>Course activities are designed to enable the command team to examine how its collective leadership creates or inhibits the conditions required for trust, clarity, appropriate challenge, accountability, initiative and effective organisational performance.</w:t>
       </w:r>
     </w:p>
     <w:p>
@@ -3043,7 +3057,7 @@
           <w:i w:val="false"/>
           <w:sz w:val="19"/>
         </w:rPr>
-        <w:t>Course duration may vary between 8 and 10 training days depending on activity, travel requirements, learner experience and course design.</w:t>
+        <w:t>Learning identified during ELDA Command is to inform the command team's subsequent working practices and each member's ongoing Leadership Development Plan.</w:t>
       </w:r>
     </w:p>
     <w:p>
@@ -3073,7 +3087,7 @@
           <w:i w:val="false"/>
           <w:sz w:val="19"/>
         </w:rPr>
-        <w:t>Activity selection, instructor allocation and delivery are to comply with the NZALC Safety Management Plan and applicable activity SOPs.</w:t>
+        <w:t>Course duration may vary between 8 and 10 training days depending on activity, travel requirements, team composition and course design.</w:t>
       </w:r>
     </w:p>
     <w:p>
@@ -3103,6 +3117,36 @@
           <w:i w:val="false"/>
           <w:sz w:val="19"/>
         </w:rPr>
+        <w:t>Activity selection, instructor allocation and delivery are to comply with the NZALC Safety Management Plan and applicable activity SOPs.</w:t>
+      </w:r>
+    </w:p>
+    <w:p>
+      <w:pPr>
+        <w:pStyle w:val="Normal"/>
+        <w:tabs>
+          <w:tab w:val="clear" w:pos="720"/>
+          <w:tab w:val="left" w:pos="397" w:leader="none"/>
+        </w:tabs>
+        <w:spacing w:lineRule="auto" w:line="252" w:before="20" w:after="40"/>
+        <w:ind w:hanging="397" w:left="397"/>
+        <w:rPr/>
+      </w:pPr>
+      <w:r>
+        <w:rPr>
+          <w:rFonts w:cs="Arial"/>
+          <w:color w:val="002516"/>
+          <w:sz w:val="19"/>
+        </w:rPr>
+        <w:t>12.</w:t>
+        <w:tab/>
+      </w:r>
+      <w:r>
+        <w:rPr>
+          <w:rFonts w:cs="Arial"/>
+          <w:b w:val="false"/>
+          <w:i w:val="false"/>
+          <w:sz w:val="19"/>
+        </w:rPr>
         <w:t>The Learning Provider is the New Zealand Army Leadership Centre (NZALC).</w:t>
       </w:r>
     </w:p>
@@ -3169,7 +3213,7 @@
           <w:color w:val="002516"/>
           <w:sz w:val="21"/>
         </w:rPr>
-        <w:t>COG 1: Command Effectiveness</w:t>
+        <w:t>COG 1: Collective Command Effectiveness</w:t>
       </w:r>
     </w:p>
     <w:p>
@@ -3207,7 +3251,7 @@
           <w:color w:val="000000"/>
           <w:sz w:val="22"/>
         </w:rPr>
-        <w:t>Evaluate personal command behaviour, judgement and bias</w:t>
+        <w:t>Develop shared understanding within the command team</w:t>
       </w:r>
     </w:p>
     <w:p>
@@ -3223,7 +3267,7 @@
           <w:b w:val="false"/>
           <w:i w:val="false"/>
         </w:rPr>
-        <w:t>Learners critically evaluate their default behaviours, assumptions, biases and decision-making tendencies, particularly under conditions of pressure, uncertainty and complexity, and assess their effect on people, teams and organisational outcomes.</w:t>
+        <w:t>Learners identify and evaluate individual and collective leadership preferences, behaviours, assumptions and biases within the command team, and their effect on command relationships, decisions and effectiveness.</w:t>
       </w:r>
     </w:p>
     <w:p>
@@ -3261,7 +3305,7 @@
           <w:color w:val="000000"/>
           <w:sz w:val="22"/>
         </w:rPr>
-        <w:t>Exercise judgement and make decisions in complex and demanding conditions</w:t>
+        <w:t>Strengthen cohesion and effectiveness across the command team</w:t>
       </w:r>
     </w:p>
     <w:p>
@@ -3277,7 +3321,7 @@
           <w:b w:val="false"/>
           <w:i w:val="false"/>
         </w:rPr>
-        <w:t>Learners exercise judgement, balance competing demands and risk, make timely decisions with incomplete information, and review and adapt their decisions as circumstances change.</w:t>
+        <w:t>Learners develop trust, clarity, appropriate challenge, communication and productive working relationships across commanders, staff and subordinate command teams, and establish the working practices that sustain them.</w:t>
       </w:r>
     </w:p>
     <w:p>
@@ -3315,7 +3359,7 @@
           <w:color w:val="000000"/>
           <w:sz w:val="22"/>
         </w:rPr>
-        <w:t>Create the conditions for effective team and organisational performance</w:t>
+        <w:t>Exercise collective judgement in complex and demanding conditions</w:t>
       </w:r>
     </w:p>
     <w:p>
@@ -3331,7 +3375,7 @@
           <w:b w:val="false"/>
           <w:i w:val="false"/>
         </w:rPr>
-        <w:t>Learners deliberately shape the leadership environment to enable trust, clarity, appropriate challenge, accountability, initiative and effective performance, recognising the effect their behaviour and use of authority have on others.</w:t>
+        <w:t>Learners apply individual and collective judgement, integrate differing perspectives, balance competing demands and risk, and make and adapt effective decisions under uncertainty and pressure.</w:t>
       </w:r>
     </w:p>
     <w:p>
@@ -3369,7 +3413,7 @@
           <w:color w:val="000000"/>
           <w:sz w:val="22"/>
         </w:rPr>
-        <w:t>Establish strategies for sustained command effectiveness across changing contexts</w:t>
+        <w:t>Create the conditions for organisational performance</w:t>
       </w:r>
     </w:p>
     <w:p>
@@ -3385,7 +3429,7 @@
           <w:b w:val="false"/>
           <w:i w:val="false"/>
         </w:rPr>
-        <w:t>Learners integrate experiential learning, feedback and self-evaluation to identify command and leadership strengths, risks and development priorities, and establish deliberate strategies for sustained command effectiveness across changing contexts and responsibilities.</w:t>
+        <w:t>Learners align leadership effort across the command team and deliberately shape the command environment to enable accountability, initiative, cohesion and effective organisational performance.</w:t>
       </w:r>
     </w:p>
     <w:sectPr>

</xml_diff>

<commit_message>
Rewrite ELDA Command in full and restructure the pathway overview
Replace the Command data sheet with the collective command-team version
(learners, competency, next step, capacity to be confirmed, notes and the
four learning outcomes with their descriptors). Rebuild the pathway page
with the NZALC title, a scope bar under the course headings, a uniform
four-stage developmental logic per course and the new key message, and add
the Command capacity and suitability items to Points for Validation.

Co-Authored-By: Claude Fable 5.1 <noreply@anthropic.com>
Claude-Session: https://claude.ai/code/session_01LgFPs3fMSncBgbYQ3PfA3o
</commit_message>
<xml_diff>
--- a/output/elda-command-data-sheet.docx
+++ b/output/elda-command-data-sheet.docx
@@ -815,7 +815,7 @@
                 <w:i w:val="false"/>
                 <w:sz w:val="19"/>
               </w:rPr>
-              <w:t>The aim of ELDA Command is to develop the collective effectiveness of command teams by strengthening shared understanding, cohesion, judgement and leadership alignment, enabling them to create the conditions for effective organisational performance in complex and demanding environments.</w:t>
+              <w:t>The aim of ELDA Command is to develop the collective effectiveness of command teams and leadership groups by strengthening shared understanding, cohesion, judgement and leadership alignment, enabling them to create the conditions for effective organisational performance in complex and demanding environments.</w:t>
             </w:r>
           </w:p>
         </w:tc>
@@ -876,7 +876,7 @@
                 <w:i w:val="false"/>
                 <w:sz w:val="19"/>
               </w:rPr>
-              <w:t>Retain the existing DLMS qualifications/certifications, subject to confirmation that these accurately represent the qualification or certification awarded:</w:t>
+              <w:t>Retain the existing DLMS qualifications/certifications, subject to confirmation that these accurately represent the qualification, certification or activity result awarded:</w:t>
             </w:r>
             <w:r>
               <w:rPr/>
@@ -1015,7 +1015,7 @@
                 <w:i w:val="false"/>
                 <w:sz w:val="19"/>
               </w:rPr>
-              <w:t>1. Established or forming command teams and leadership groups, including unit headquarters, command teams, principal staff officers and subordinate command teams, where collective leadership effectiveness is critical to organisational performance.</w:t>
+              <w:t>1. Established or forming command teams and leadership groups for whom collective leadership effectiveness is critical to organisational performance.</w:t>
             </w:r>
             <w:r>
               <w:rPr/>
@@ -1028,7 +1028,72 @@
                 <w:i w:val="false"/>
                 <w:sz w:val="19"/>
               </w:rPr>
-              <w:t>2. Other appropriately constituted senior leadership groups, as determined by the Learning Provider in consultation with the relevant command and career management authorities.</w:t>
+              <w:t>2. This may include:</w:t>
+            </w:r>
+            <w:r>
+              <w:rPr/>
+              <w:br/>
+            </w:r>
+            <w:r>
+              <w:rPr>
+                <w:rFonts w:cs="Arial"/>
+                <w:b w:val="false"/>
+                <w:i w:val="false"/>
+                <w:sz w:val="19"/>
+              </w:rPr>
+              <w:t>• unit headquarters;</w:t>
+            </w:r>
+            <w:r>
+              <w:rPr/>
+              <w:br/>
+            </w:r>
+            <w:r>
+              <w:rPr>
+                <w:rFonts w:cs="Arial"/>
+                <w:b w:val="false"/>
+                <w:i w:val="false"/>
+                <w:sz w:val="19"/>
+              </w:rPr>
+              <w:t>• unit command teams and principal staff officers;</w:t>
+            </w:r>
+            <w:r>
+              <w:rPr/>
+              <w:br/>
+            </w:r>
+            <w:r>
+              <w:rPr>
+                <w:rFonts w:cs="Arial"/>
+                <w:b w:val="false"/>
+                <w:i w:val="false"/>
+                <w:sz w:val="19"/>
+              </w:rPr>
+              <w:t>• unit command teams operating with subordinate command teams; and</w:t>
+            </w:r>
+            <w:r>
+              <w:rPr/>
+              <w:br/>
+            </w:r>
+            <w:r>
+              <w:rPr>
+                <w:rFonts w:cs="Arial"/>
+                <w:b w:val="false"/>
+                <w:i w:val="false"/>
+                <w:sz w:val="19"/>
+              </w:rPr>
+              <w:t>• other appropriately constituted command or senior leadership groups.</w:t>
+            </w:r>
+            <w:r>
+              <w:rPr/>
+              <w:br/>
+            </w:r>
+            <w:r>
+              <w:rPr>
+                <w:rFonts w:cs="Arial"/>
+                <w:b w:val="false"/>
+                <w:i w:val="false"/>
+                <w:sz w:val="19"/>
+              </w:rPr>
+              <w:t>3. Other groups may attend where command-level experiential leadership development is appropriate, as determined by the Learning Provider in consultation with the relevant command or career management authority.</w:t>
             </w:r>
           </w:p>
         </w:tc>
@@ -1089,7 +1154,7 @@
                 <w:i w:val="false"/>
                 <w:sz w:val="19"/>
               </w:rPr>
-              <w:t>Learners will be able to contribute effectively to a cohesive command team, applying self-awareness, shared understanding and sound judgement to align leadership effort, strengthen command relationships and create the conditions for effective organisational performance.</w:t>
+              <w:t>Participants will be able to contribute effectively to a cohesive command team by applying self-awareness, shared understanding and sound judgement to strengthen command relationships, align leadership effort and create the conditions for effective organisational performance in complex and demanding contexts.</w:t>
             </w:r>
           </w:p>
         </w:tc>
@@ -1150,7 +1215,7 @@
                 <w:i w:val="false"/>
                 <w:sz w:val="19"/>
               </w:rPr>
-              <w:t>1. Apply the shared understanding, working practices and leadership alignment developed on ELDA Command within the command team's current appointments and operating rhythm.</w:t>
+              <w:t>1. Apply the insights, behaviours and collective practices developed through ELDA Command within the participating headquarters, command team or leadership group.</w:t>
             </w:r>
             <w:r>
               <w:rPr/>
@@ -1163,7 +1228,7 @@
                 <w:i w:val="false"/>
                 <w:sz w:val="19"/>
               </w:rPr>
-              <w:t>2. Continue deliberate collective reflection, feedback and adaptation of command behaviour as the team's context, composition and responsibilities change.</w:t>
+              <w:t>2. Continue deliberate reflection, feedback and adaptation at both individual and collective levels as context, responsibility and organisational demands change.</w:t>
             </w:r>
             <w:r>
               <w:rPr/>
@@ -1176,7 +1241,7 @@
                 <w:i w:val="false"/>
                 <w:sz w:val="19"/>
               </w:rPr>
-              <w:t>3. Review and update individual Leadership Development Plans (LDPs) to reflect the command and leadership development priorities identified through the course.</w:t>
+              <w:t>3. Incorporate identified individual and collective development priorities into relevant Leadership Development Plans, command-team development activities and ongoing organisational learning.</w:t>
             </w:r>
           </w:p>
         </w:tc>
@@ -1394,6 +1459,34 @@
           <w:i w:val="false"/>
         </w:rPr>
         <w:t>Attendance requires CI NZALC approval.</w:t>
+      </w:r>
+    </w:p>
+    <w:p>
+      <w:pPr>
+        <w:pStyle w:val="Normal"/>
+        <w:tabs>
+          <w:tab w:val="clear" w:pos="720"/>
+          <w:tab w:val="left" w:pos="397" w:leader="none"/>
+        </w:tabs>
+        <w:spacing w:before="60" w:after="40"/>
+        <w:ind w:hanging="397" w:left="397"/>
+        <w:rPr/>
+      </w:pPr>
+      <w:r>
+        <w:rPr>
+          <w:rFonts w:cs="Arial"/>
+          <w:color w:val="000000"/>
+        </w:rPr>
+        <w:t>3.</w:t>
+        <w:tab/>
+      </w:r>
+      <w:r>
+        <w:rPr>
+          <w:rFonts w:cs="Arial"/>
+          <w:b w:val="false"/>
+          <w:i w:val="false"/>
+        </w:rPr>
+        <w:t>All participants are to meet any additional requirements associated with the selected ELDA activity.</w:t>
       </w:r>
     </w:p>
     <w:p>
@@ -1627,7 +1720,7 @@
                 <w:i w:val="false"/>
                 <w:sz w:val="19"/>
               </w:rPr>
-              <w:t>Maximum: 8</w:t>
+              <w:t>Maximum: TBC, dependent on participating command-team composition and course design.</w:t>
             </w:r>
           </w:p>
         </w:tc>
@@ -1816,7 +1909,7 @@
                 <w:i w:val="false"/>
                 <w:sz w:val="19"/>
               </w:rPr>
-              <w:t>Maximum number of NZDF Civilian learners: 2</w:t>
+              <w:t>Maximum number of NZDF Civilian learners: 2, subject to review against the revised collective delivery model.</w:t>
             </w:r>
           </w:p>
         </w:tc>
@@ -1879,7 +1972,7 @@
                 <w:i w:val="false"/>
                 <w:sz w:val="19"/>
               </w:rPr>
-              <w:t>Maximum number of International (non-MAP) learners: 1</w:t>
+              <w:t>Maximum number of International (non-MAP) learners: 1, subject to review.</w:t>
             </w:r>
           </w:p>
         </w:tc>
@@ -1940,7 +2033,7 @@
                 <w:i w:val="false"/>
                 <w:sz w:val="19"/>
               </w:rPr>
-              <w:t>Maximum number of non-NZDF learners: 1</w:t>
+              <w:t>Maximum number of non-NZDF learners: 1, subject to review.</w:t>
             </w:r>
           </w:p>
         </w:tc>
@@ -2376,7 +2469,7 @@
           <w:b w:val="false"/>
           <w:i w:val="false"/>
         </w:rPr>
-        <w:t xml:space="preserve"> A maximum instructor-to-learner ratio of 1:4 is to be maintained where required by the applicable activity and safety framework.</w:t>
+        <w:t xml:space="preserve"> Instructor-to-learner ratios are to comply with the applicable ELDA activity, NZALC Safety Management Plan and activity safety framework.</w:t>
       </w:r>
     </w:p>
     <w:p>
@@ -2412,7 +2505,7 @@
           <w:b w:val="false"/>
           <w:i w:val="false"/>
         </w:rPr>
-        <w:t xml:space="preserve"> Instructors responsible for developmental facilitation are to possess the experience and capability appropriate to facilitating command-team development at unit level and above.</w:t>
+        <w:t xml:space="preserve"> Instructors responsible for developmental facilitation are to possess the experience and capability appropriate to facilitating command-team and senior leadership development.</w:t>
       </w:r>
     </w:p>
     <w:p>
@@ -2697,20 +2790,6 @@
     <w:p>
       <w:pPr>
         <w:pStyle w:val="Normal"/>
-        <w:rPr/>
-      </w:pPr>
-      <w:r>
-        <w:rPr>
-          <w:rFonts w:cs="Arial"/>
-          <w:b w:val="false"/>
-          <w:i w:val="false"/>
-        </w:rPr>
-        <w:t>Nominations are normally made for a command team as a whole, by or on behalf of its commander.</w:t>
-      </w:r>
-    </w:p>
-    <w:p>
-      <w:pPr>
-        <w:pStyle w:val="Normal"/>
         <w:keepNext w:val="true"/>
         <w:spacing w:before="240" w:after="80"/>
         <w:rPr/>
@@ -2737,7 +2816,133 @@
           <w:b w:val="false"/>
           <w:i w:val="false"/>
         </w:rPr>
-        <w:t>Priority is given to command teams preparing for, or recently assuming, significant command appointments, and to command teams entering demanding operational or organisational periods, as determined by the Learning Provider in consultation with the relevant command and career management authorities.</w:t>
+        <w:t>Priority is given to established or forming command teams and leadership groups where collective experiential development will support current or anticipated organisational requirements.</w:t>
+      </w:r>
+    </w:p>
+    <w:p>
+      <w:pPr>
+        <w:pStyle w:val="Normal"/>
+        <w:rPr/>
+      </w:pPr>
+      <w:r>
+        <w:rPr>
+          <w:rFonts w:cs="Arial"/>
+          <w:b w:val="false"/>
+          <w:i w:val="false"/>
+        </w:rPr>
+        <w:t>Priority may include:</w:t>
+      </w:r>
+    </w:p>
+    <w:p>
+      <w:pPr>
+        <w:pStyle w:val="Normal"/>
+        <w:tabs>
+          <w:tab w:val="clear" w:pos="720"/>
+          <w:tab w:val="left" w:pos="397" w:leader="none"/>
+        </w:tabs>
+        <w:spacing w:before="60" w:after="40"/>
+        <w:ind w:hanging="397" w:left="397"/>
+        <w:rPr/>
+      </w:pPr>
+      <w:r>
+        <w:rPr>
+          <w:rFonts w:cs="Arial"/>
+          <w:color w:val="000000"/>
+        </w:rPr>
+        <w:t>1.</w:t>
+        <w:tab/>
+      </w:r>
+      <w:r>
+        <w:rPr>
+          <w:rFonts w:cs="Arial"/>
+          <w:b w:val="false"/>
+          <w:i w:val="false"/>
+        </w:rPr>
+        <w:t>unit headquarters;</w:t>
+      </w:r>
+    </w:p>
+    <w:p>
+      <w:pPr>
+        <w:pStyle w:val="Normal"/>
+        <w:tabs>
+          <w:tab w:val="clear" w:pos="720"/>
+          <w:tab w:val="left" w:pos="397" w:leader="none"/>
+        </w:tabs>
+        <w:spacing w:before="60" w:after="40"/>
+        <w:ind w:hanging="397" w:left="397"/>
+        <w:rPr/>
+      </w:pPr>
+      <w:r>
+        <w:rPr>
+          <w:rFonts w:cs="Arial"/>
+          <w:color w:val="000000"/>
+        </w:rPr>
+        <w:t>2.</w:t>
+        <w:tab/>
+      </w:r>
+      <w:r>
+        <w:rPr>
+          <w:rFonts w:cs="Arial"/>
+          <w:b w:val="false"/>
+          <w:i w:val="false"/>
+        </w:rPr>
+        <w:t>unit command teams and principal staff officers;</w:t>
+      </w:r>
+    </w:p>
+    <w:p>
+      <w:pPr>
+        <w:pStyle w:val="Normal"/>
+        <w:tabs>
+          <w:tab w:val="clear" w:pos="720"/>
+          <w:tab w:val="left" w:pos="397" w:leader="none"/>
+        </w:tabs>
+        <w:spacing w:before="60" w:after="40"/>
+        <w:ind w:hanging="397" w:left="397"/>
+        <w:rPr/>
+      </w:pPr>
+      <w:r>
+        <w:rPr>
+          <w:rFonts w:cs="Arial"/>
+          <w:color w:val="000000"/>
+        </w:rPr>
+        <w:t>3.</w:t>
+        <w:tab/>
+      </w:r>
+      <w:r>
+        <w:rPr>
+          <w:rFonts w:cs="Arial"/>
+          <w:b w:val="false"/>
+          <w:i w:val="false"/>
+        </w:rPr>
+        <w:t>unit command teams together with subordinate command teams; and</w:t>
+      </w:r>
+    </w:p>
+    <w:p>
+      <w:pPr>
+        <w:pStyle w:val="Normal"/>
+        <w:tabs>
+          <w:tab w:val="clear" w:pos="720"/>
+          <w:tab w:val="left" w:pos="397" w:leader="none"/>
+        </w:tabs>
+        <w:spacing w:before="60" w:after="40"/>
+        <w:ind w:hanging="397" w:left="397"/>
+        <w:rPr/>
+      </w:pPr>
+      <w:r>
+        <w:rPr>
+          <w:rFonts w:cs="Arial"/>
+          <w:color w:val="000000"/>
+        </w:rPr>
+        <w:t>4.</w:t>
+        <w:tab/>
+      </w:r>
+      <w:r>
+        <w:rPr>
+          <w:rFonts w:cs="Arial"/>
+          <w:b w:val="false"/>
+          <w:i w:val="false"/>
+        </w:rPr>
+        <w:t>other command or senior leadership groups identified by the Learning Provider and relevant command authority.</w:t>
       </w:r>
     </w:p>
     <w:p>
@@ -2769,7 +2974,7 @@
           <w:b w:val="false"/>
           <w:i w:val="false"/>
         </w:rPr>
-        <w:t>Retain current administrative configuration as applicable.</w:t>
+        <w:t>Retain current administrative configuration as applicable, subject to confirmation in SOLO.</w:t>
       </w:r>
     </w:p>
     <w:p>
@@ -2817,7 +3022,7 @@
           <w:i w:val="false"/>
           <w:sz w:val="19"/>
         </w:rPr>
-        <w:t>ELDA Command develops the collective effectiveness of command teams through experiential learning conducted in complex and demanding environments involving real consequences, uncertainty, interpersonal dynamics and managed risk.</w:t>
+        <w:t>ELDA Command develops collective command effectiveness through experiential learning conducted in complex and demanding environments involving uncertainty, interpersonal dynamics, consequence and managed risk.</w:t>
       </w:r>
     </w:p>
     <w:p>
@@ -2847,7 +3052,7 @@
           <w:i w:val="false"/>
           <w:sz w:val="19"/>
         </w:rPr>
-        <w:t>The course is normally delivered to an existing or forming command or leadership collective, for example a unit headquarters, or a unit command team together with its subordinate command teams, rather than to individuals drawn from different organisations.</w:t>
+        <w:t>The primary developmental unit is the command team or leadership group. Individual development remains important, but is developed in the context of how individual behaviours, relationships and judgement contribute to collective command effectiveness.</w:t>
       </w:r>
     </w:p>
     <w:p>
@@ -2877,7 +3082,7 @@
           <w:i w:val="false"/>
           <w:sz w:val="19"/>
         </w:rPr>
-        <w:t>The selected adventure activity provides the experiential vehicle for command-team development; successful completion of the activity is not, in itself, the primary learning outcome.</w:t>
+        <w:t>The selected ELDA activity provides the experiential vehicle for command and leadership development. Successful completion of the activity is not, in itself, the primary learning outcome.</w:t>
       </w:r>
     </w:p>
     <w:p>
@@ -2907,7 +3112,7 @@
           <w:i w:val="false"/>
           <w:sz w:val="19"/>
         </w:rPr>
-        <w:t>The course develops shared understanding by enabling team members to identify and evaluate their individual and collective leadership preferences, default behaviours, assumptions and biases, and the effects these have on command relationships, decisions and organisational outcomes.</w:t>
+        <w:t>ELDA Command develops individual and collective self-awareness by enabling participants to identify and evaluate leadership preferences, behaviours, assumptions, biases and decision-making tendencies, and understand their effects on relationships, team dynamics and organisational outcomes.</w:t>
       </w:r>
     </w:p>
     <w:p>
@@ -2937,7 +3142,7 @@
           <w:i w:val="false"/>
           <w:sz w:val="19"/>
         </w:rPr>
-        <w:t>Psychometric, leadership and team-development tools may be used to support self-awareness, shared understanding and team development. These tools support the learning outcomes rather than constitute learning outcomes in themselves.</w:t>
+        <w:t>Psychometric, leadership and team-development tools may be used to support individual self-awareness, shared understanding, reflection and collective development. These tools support the learning outcomes rather than constitute learning outcomes in themselves.</w:t>
       </w:r>
     </w:p>
     <w:p>
@@ -2967,7 +3172,7 @@
           <w:i w:val="false"/>
           <w:sz w:val="19"/>
         </w:rPr>
-        <w:t>The command team is provided repeated opportunities to exercise individual and collective judgement, make decisions, observe their effects, receive feedback, reflect, adapt and reapply their learning together.</w:t>
+        <w:t>Participants are provided repeated opportunities to exercise individual and collective judgement, make decisions, observe their effects, receive feedback, reflect, adapt and reapply their learning.</w:t>
       </w:r>
     </w:p>
     <w:p>
@@ -2997,7 +3202,7 @@
           <w:i w:val="false"/>
           <w:sz w:val="19"/>
         </w:rPr>
-        <w:t>Army ethos and values are embedded throughout the course and are demonstrated through observable judgement, decision-making, use of authority, treatment of others and leadership behaviour within the command team.</w:t>
+        <w:t>Course activities are designed to strengthen trust, shared understanding, clarity, appropriate challenge, communication and cohesion across the participating command team or leadership group.</w:t>
       </w:r>
     </w:p>
     <w:p>
@@ -3027,7 +3232,7 @@
           <w:i w:val="false"/>
           <w:sz w:val="19"/>
         </w:rPr>
-        <w:t>Course activities are designed to enable the command team to examine how its collective leadership creates or inhibits the conditions required for trust, clarity, appropriate challenge, accountability, initiative and effective organisational performance.</w:t>
+        <w:t>Particular emphasis is placed on the relationships and interactions through which command is exercised, including those between commanders, principal staff, peers and subordinate command teams.</w:t>
       </w:r>
     </w:p>
     <w:p>
@@ -3057,7 +3262,7 @@
           <w:i w:val="false"/>
           <w:sz w:val="19"/>
         </w:rPr>
-        <w:t>Learning identified during ELDA Command is to inform the command team's subsequent working practices and each member's ongoing Leadership Development Plan.</w:t>
+        <w:t>Army ethos and values are embedded throughout the course and demonstrated through observable judgement, decision-making, use of authority, relationships and leadership behaviour.</w:t>
       </w:r>
     </w:p>
     <w:p>
@@ -3087,7 +3292,7 @@
           <w:i w:val="false"/>
           <w:sz w:val="19"/>
         </w:rPr>
-        <w:t>Course duration may vary between 8 and 10 training days depending on activity, travel requirements, team composition and course design.</w:t>
+        <w:t>Participants examine how their collective leadership environment enables or inhibits accountability, initiative, alignment, cohesion and effective organisational performance.</w:t>
       </w:r>
     </w:p>
     <w:p>
@@ -3117,7 +3322,7 @@
           <w:i w:val="false"/>
           <w:sz w:val="19"/>
         </w:rPr>
-        <w:t>Activity selection, instructor allocation and delivery are to comply with the NZALC Safety Management Plan and applicable activity SOPs.</w:t>
+        <w:t>Learning identified during ELDA Command is to inform both individual development and the continued deliberate development of the participating command team or leadership group.</w:t>
       </w:r>
     </w:p>
     <w:p>
@@ -3138,6 +3343,66 @@
           <w:sz w:val="19"/>
         </w:rPr>
         <w:t>12.</w:t>
+        <w:tab/>
+      </w:r>
+      <w:r>
+        <w:rPr>
+          <w:rFonts w:cs="Arial"/>
+          <w:b w:val="false"/>
+          <w:i w:val="false"/>
+          <w:sz w:val="19"/>
+        </w:rPr>
+        <w:t>Course duration may vary between 8 and 10 training days depending on activity, travel requirements, participant experience, group composition and course design.</w:t>
+      </w:r>
+    </w:p>
+    <w:p>
+      <w:pPr>
+        <w:pStyle w:val="Normal"/>
+        <w:tabs>
+          <w:tab w:val="clear" w:pos="720"/>
+          <w:tab w:val="left" w:pos="397" w:leader="none"/>
+        </w:tabs>
+        <w:spacing w:lineRule="auto" w:line="252" w:before="20" w:after="40"/>
+        <w:ind w:hanging="397" w:left="397"/>
+        <w:rPr/>
+      </w:pPr>
+      <w:r>
+        <w:rPr>
+          <w:rFonts w:cs="Arial"/>
+          <w:color w:val="002516"/>
+          <w:sz w:val="19"/>
+        </w:rPr>
+        <w:t>13.</w:t>
+        <w:tab/>
+      </w:r>
+      <w:r>
+        <w:rPr>
+          <w:rFonts w:cs="Arial"/>
+          <w:b w:val="false"/>
+          <w:i w:val="false"/>
+          <w:sz w:val="19"/>
+        </w:rPr>
+        <w:t>Activity selection, instructor allocation and delivery are to comply with the NZALC Safety Management Plan and applicable activity SOPs.</w:t>
+      </w:r>
+    </w:p>
+    <w:p>
+      <w:pPr>
+        <w:pStyle w:val="Normal"/>
+        <w:tabs>
+          <w:tab w:val="clear" w:pos="720"/>
+          <w:tab w:val="left" w:pos="397" w:leader="none"/>
+        </w:tabs>
+        <w:spacing w:lineRule="auto" w:line="252" w:before="20" w:after="40"/>
+        <w:ind w:hanging="397" w:left="397"/>
+        <w:rPr/>
+      </w:pPr>
+      <w:r>
+        <w:rPr>
+          <w:rFonts w:cs="Arial"/>
+          <w:color w:val="002516"/>
+          <w:sz w:val="19"/>
+        </w:rPr>
+        <w:t>14.</w:t>
         <w:tab/>
       </w:r>
       <w:r>
@@ -3267,7 +3532,23 @@
           <w:b w:val="false"/>
           <w:i w:val="false"/>
         </w:rPr>
-        <w:t>Learners identify and evaluate individual and collective leadership preferences, behaviours, assumptions and biases within the command team, and their effect on command relationships, decisions and effectiveness.</w:t>
+        <w:t>Participants evaluate individual and collective leadership preferences, behaviours, assumptions and biases, and develop shared understanding of how these affect relationships, interactions, judgement and command-team effectiveness.</w:t>
+      </w:r>
+    </w:p>
+    <w:p>
+      <w:pPr>
+        <w:pStyle w:val="Normal"/>
+        <w:spacing w:before="0" w:after="80"/>
+        <w:ind w:left="312"/>
+        <w:rPr/>
+      </w:pPr>
+      <w:r>
+        <w:rPr>
+          <w:rFonts w:cs="Arial"/>
+          <w:b w:val="false"/>
+          <w:i w:val="false"/>
+        </w:rPr>
+        <w:t>The emphasis is not simply on individual self-awareness, but on making that self-awareness useful to the team.</w:t>
       </w:r>
     </w:p>
     <w:p>
@@ -3321,7 +3602,23 @@
           <w:b w:val="false"/>
           <w:i w:val="false"/>
         </w:rPr>
-        <w:t>Learners develop trust, clarity, appropriate challenge, communication and productive working relationships across commanders, staff and subordinate command teams, and establish the working practices that sustain them.</w:t>
+        <w:t>Participants develop the trust, clarity, communication, relationships and capacity for appropriate challenge required for effective command-team functioning.</w:t>
+      </w:r>
+    </w:p>
+    <w:p>
+      <w:pPr>
+        <w:pStyle w:val="Normal"/>
+        <w:spacing w:before="0" w:after="80"/>
+        <w:ind w:left="312"/>
+        <w:rPr/>
+      </w:pPr>
+      <w:r>
+        <w:rPr>
+          <w:rFonts w:cs="Arial"/>
+          <w:b w:val="false"/>
+          <w:i w:val="false"/>
+        </w:rPr>
+        <w:t>They examine how leadership behaviour, interpersonal dynamics, roles and use of authority enable or inhibit cohesion, shared understanding and collective effectiveness.</w:t>
       </w:r>
     </w:p>
     <w:p>
@@ -3375,7 +3672,23 @@
           <w:b w:val="false"/>
           <w:i w:val="false"/>
         </w:rPr>
-        <w:t>Learners apply individual and collective judgement, integrate differing perspectives, balance competing demands and risk, and make and adapt effective decisions under uncertainty and pressure.</w:t>
+        <w:t>Participants integrate differing perspectives, balance competing demands and risk, make decisions with incomplete information, and review and adapt their approach as circumstances change.</w:t>
+      </w:r>
+    </w:p>
+    <w:p>
+      <w:pPr>
+        <w:pStyle w:val="Normal"/>
+        <w:spacing w:before="0" w:after="80"/>
+        <w:ind w:left="312"/>
+        <w:rPr/>
+      </w:pPr>
+      <w:r>
+        <w:rPr>
+          <w:rFonts w:cs="Arial"/>
+          <w:b w:val="false"/>
+          <w:i w:val="false"/>
+        </w:rPr>
+        <w:t>The command team develops its ability to use its collective capability, rather than relying solely on the judgement of individual commanders.</w:t>
       </w:r>
     </w:p>
     <w:p>
@@ -3429,7 +3742,23 @@
           <w:b w:val="false"/>
           <w:i w:val="false"/>
         </w:rPr>
-        <w:t>Learners align leadership effort across the command team and deliberately shape the command environment to enable accountability, initiative, cohesion and effective organisational performance.</w:t>
+        <w:t>Participants align leadership effort and deliberately shape the command environment to enable trust, clarity, accountability, initiative, appropriate challenge and effective performance.</w:t>
+      </w:r>
+    </w:p>
+    <w:p>
+      <w:pPr>
+        <w:pStyle w:val="Normal"/>
+        <w:spacing w:before="0" w:after="80"/>
+        <w:ind w:left="312"/>
+        <w:rPr/>
+      </w:pPr>
+      <w:r>
+        <w:rPr>
+          <w:rFonts w:cs="Arial"/>
+          <w:b w:val="false"/>
+          <w:i w:val="false"/>
+        </w:rPr>
+        <w:t>They evaluate how the command team's collective behaviour, relationships, decisions and use of authority affect subordinate teams and wider organisational outcomes.</w:t>
       </w:r>
     </w:p>
     <w:sectPr>
@@ -3533,7 +3862,7 @@
         <w:sz w:val="17"/>
         <w:rFonts w:cs="Arial"/>
       </w:rPr>
-      <w:t>4</w:t>
+      <w:t>5</w:t>
     </w:r>
     <w:r>
       <w:rPr>
@@ -3576,7 +3905,7 @@
         <w:sz w:val="17"/>
         <w:rFonts w:cs="Arial"/>
       </w:rPr>
-      <w:t>4</w:t>
+      <w:t>5</w:t>
     </w:r>
     <w:r>
       <w:rPr>
@@ -3657,7 +3986,7 @@
         <w:sz w:val="17"/>
         <w:rFonts w:cs="Arial"/>
       </w:rPr>
-      <w:t>4</w:t>
+      <w:t>5</w:t>
     </w:r>
     <w:r>
       <w:rPr>
@@ -3700,7 +4029,7 @@
         <w:sz w:val="17"/>
         <w:rFonts w:cs="Arial"/>
       </w:rPr>
-      <w:t>4</w:t>
+      <w:t>5</w:t>
     </w:r>
     <w:r>
       <w:rPr>

</xml_diff>